<commit_message>
results: capraz_rapor_tam.docx md'den yeniden üretildi
</commit_message>
<xml_diff>
--- a/results/capraz_rapor_tam.docx
+++ b/results/capraz_rapor_tam.docx
@@ -2,7 +2,7 @@
 <file path=word/document.xml><?xml version="1.0" encoding="utf-8"?>
 <w:document xmlns:w="http://schemas.openxmlformats.org/wordprocessingml/2006/main" xmlns:m="http://schemas.openxmlformats.org/officeDocument/2006/math" xmlns:r="http://schemas.openxmlformats.org/officeDocument/2006/relationships" xmlns:o="urn:schemas-microsoft-com:office:office" xmlns:v="urn:schemas-microsoft-com:vml" xmlns:w10="urn:schemas-microsoft-com:office:word" xmlns:a="http://schemas.openxmlformats.org/drawingml/2006/main" xmlns:pic="http://schemas.openxmlformats.org/drawingml/2006/picture" xmlns:wp="http://schemas.openxmlformats.org/drawingml/2006/wordprocessingDrawing">
   <w:body>
-    <w:bookmarkStart w:id="26" w:name="X44df25a49b9c5b75902b0b62087a5832676cfdf"/>
+    <w:bookmarkStart w:id="15" w:name="X44df25a49b9c5b75902b0b62087a5832676cfdf"/>
     <w:p>
       <w:pPr>
         <w:pStyle w:val="Heading1"/>
@@ -78,7 +78,7 @@
         <w:t xml:space="preserve">Modeller: anthropic/claude-sonnet-4-6, openai/gpt-4o, gemini/gemini-3.6-flash, deepseek/deepseek-v4-flash, grok/grok-4.6, kumru/vngrs-ai/Kumru-2B</w:t>
       </w:r>
     </w:p>
-    <w:bookmarkStart w:id="20" w:name="X9e42956d66f97ce22a628b2cdfaccf7bf270d73"/>
+    <w:bookmarkStart w:id="9" w:name="X9e42956d66f97ce22a628b2cdfaccf7bf270d73"/>
     <w:p>
       <w:pPr>
         <w:pStyle w:val="Heading2"/>
@@ -99,8 +99,8 @@
       <w:tblPr>
         <w:tblStyle w:val="Table"/>
         <w:tblW w:type="pct" w:w="5000"/>
+        <w:tblLayout w:type="fixed"/>
         <w:tblLook w:firstRow="1" w:lastRow="0" w:firstColumn="0" w:lastColumn="0" w:noHBand="0" w:noVBand="0" w:val="0020"/>
-        <w:jc w:val="start"/>
       </w:tblPr>
       <w:tblGrid>
         <w:gridCol w:w="1584"/>
@@ -111,14 +111,13 @@
       </w:tblGrid>
       <w:tr>
         <w:trPr>
-          <w:tblHeader w:val="true"/>
+          <w:tblHeader w:val="on"/>
         </w:trPr>
         <w:tc>
           <w:tcPr/>
           <w:p>
             <w:pPr>
               <w:pStyle w:val="Compact"/>
-              <w:jc w:val="left"/>
             </w:pPr>
             <w:r>
               <w:t xml:space="preserve">Model</w:t>
@@ -130,7 +129,6 @@
           <w:p>
             <w:pPr>
               <w:pStyle w:val="Compact"/>
-              <w:jc w:val="left"/>
             </w:pPr>
             <w:r>
               <w:t xml:space="preserve">V_baseline</w:t>
@@ -142,7 +140,6 @@
           <w:p>
             <w:pPr>
               <w:pStyle w:val="Compact"/>
-              <w:jc w:val="left"/>
             </w:pPr>
             <w:r>
               <w:t xml:space="preserve">V_hiyerarsi</w:t>
@@ -154,7 +151,6 @@
           <w:p>
             <w:pPr>
               <w:pStyle w:val="Compact"/>
-              <w:jc w:val="left"/>
             </w:pPr>
             <w:r>
               <w:t xml:space="preserve">Kontrol/baseline</w:t>
@@ -166,7 +162,6 @@
           <w:p>
             <w:pPr>
               <w:pStyle w:val="Compact"/>
-              <w:jc w:val="left"/>
             </w:pPr>
             <w:r>
               <w:t xml:space="preserve">Kontrol/hiyerarşi</w:t>
@@ -180,7 +175,6 @@
           <w:p>
             <w:pPr>
               <w:pStyle w:val="Compact"/>
-              <w:jc w:val="left"/>
             </w:pPr>
             <w:r>
               <w:t xml:space="preserve">Claude Sonnet 4.6</w:t>
@@ -192,7 +186,6 @@
           <w:p>
             <w:pPr>
               <w:pStyle w:val="Compact"/>
-              <w:jc w:val="left"/>
             </w:pPr>
             <w:r>
               <w:t xml:space="preserve">100% (120/120)</w:t>
@@ -204,7 +197,6 @@
           <w:p>
             <w:pPr>
               <w:pStyle w:val="Compact"/>
-              <w:jc w:val="left"/>
             </w:pPr>
             <w:r>
               <w:t xml:space="preserve">100% (120/120)</w:t>
@@ -216,7 +208,6 @@
           <w:p>
             <w:pPr>
               <w:pStyle w:val="Compact"/>
-              <w:jc w:val="left"/>
             </w:pPr>
             <w:r>
               <w:t xml:space="preserve">75% (30/40)</w:t>
@@ -228,7 +219,6 @@
           <w:p>
             <w:pPr>
               <w:pStyle w:val="Compact"/>
-              <w:jc w:val="left"/>
             </w:pPr>
             <w:r>
               <w:t xml:space="preserve">50% (20/40)</w:t>
@@ -242,7 +232,6 @@
           <w:p>
             <w:pPr>
               <w:pStyle w:val="Compact"/>
-              <w:jc w:val="left"/>
             </w:pPr>
             <w:r>
               <w:t xml:space="preserve">GPT-4o</w:t>
@@ -254,7 +243,6 @@
           <w:p>
             <w:pPr>
               <w:pStyle w:val="Compact"/>
-              <w:jc w:val="left"/>
             </w:pPr>
             <w:r>
               <w:t xml:space="preserve">9% (11/120)</w:t>
@@ -266,7 +254,6 @@
           <w:p>
             <w:pPr>
               <w:pStyle w:val="Compact"/>
-              <w:jc w:val="left"/>
             </w:pPr>
             <w:r>
               <w:t xml:space="preserve">100% (120/120)</w:t>
@@ -278,7 +265,6 @@
           <w:p>
             <w:pPr>
               <w:pStyle w:val="Compact"/>
-              <w:jc w:val="left"/>
             </w:pPr>
             <w:r>
               <w:t xml:space="preserve">100% (40/40)</w:t>
@@ -290,7 +276,6 @@
           <w:p>
             <w:pPr>
               <w:pStyle w:val="Compact"/>
-              <w:jc w:val="left"/>
             </w:pPr>
             <w:r>
               <w:t xml:space="preserve">50% (20/40)</w:t>
@@ -304,7 +289,6 @@
           <w:p>
             <w:pPr>
               <w:pStyle w:val="Compact"/>
-              <w:jc w:val="left"/>
             </w:pPr>
             <w:r>
               <w:t xml:space="preserve">Gemini 3.6 Flash</w:t>
@@ -316,7 +300,6 @@
           <w:p>
             <w:pPr>
               <w:pStyle w:val="Compact"/>
-              <w:jc w:val="left"/>
             </w:pPr>
             <w:r>
               <w:t xml:space="preserve">100% (120/120)</w:t>
@@ -328,7 +311,6 @@
           <w:p>
             <w:pPr>
               <w:pStyle w:val="Compact"/>
-              <w:jc w:val="left"/>
             </w:pPr>
             <w:r>
               <w:t xml:space="preserve">100% (120/120)</w:t>
@@ -340,7 +322,6 @@
           <w:p>
             <w:pPr>
               <w:pStyle w:val="Compact"/>
-              <w:jc w:val="left"/>
             </w:pPr>
             <w:r>
               <w:t xml:space="preserve">50% (20/40)</w:t>
@@ -352,7 +333,6 @@
           <w:p>
             <w:pPr>
               <w:pStyle w:val="Compact"/>
-              <w:jc w:val="left"/>
             </w:pPr>
             <w:r>
               <w:t xml:space="preserve">50% (20/40)</w:t>
@@ -366,7 +346,6 @@
           <w:p>
             <w:pPr>
               <w:pStyle w:val="Compact"/>
-              <w:jc w:val="left"/>
             </w:pPr>
             <w:r>
               <w:t xml:space="preserve">DeepSeek v4-flash</w:t>
@@ -378,7 +357,6 @@
           <w:p>
             <w:pPr>
               <w:pStyle w:val="Compact"/>
-              <w:jc w:val="left"/>
             </w:pPr>
             <w:r>
               <w:t xml:space="preserve">87% (104/119) [1 çözümlenemeyen]</w:t>
@@ -390,7 +368,6 @@
           <w:p>
             <w:pPr>
               <w:pStyle w:val="Compact"/>
-              <w:jc w:val="left"/>
             </w:pPr>
             <w:r>
               <w:t xml:space="preserve">100% (120/120)</w:t>
@@ -402,7 +379,6 @@
           <w:p>
             <w:pPr>
               <w:pStyle w:val="Compact"/>
-              <w:jc w:val="left"/>
             </w:pPr>
             <w:r>
               <w:t xml:space="preserve">98% (39/40)</w:t>
@@ -414,7 +390,6 @@
           <w:p>
             <w:pPr>
               <w:pStyle w:val="Compact"/>
-              <w:jc w:val="left"/>
             </w:pPr>
             <w:r>
               <w:t xml:space="preserve">50% (20/40)</w:t>
@@ -428,7 +403,6 @@
           <w:p>
             <w:pPr>
               <w:pStyle w:val="Compact"/>
-              <w:jc w:val="left"/>
             </w:pPr>
             <w:r>
               <w:t xml:space="preserve">Grok 4.6</w:t>
@@ -440,7 +414,6 @@
           <w:p>
             <w:pPr>
               <w:pStyle w:val="Compact"/>
-              <w:jc w:val="left"/>
             </w:pPr>
             <w:r>
               <w:t xml:space="preserve">100% (120/120)</w:t>
@@ -452,7 +425,6 @@
           <w:p>
             <w:pPr>
               <w:pStyle w:val="Compact"/>
-              <w:jc w:val="left"/>
             </w:pPr>
             <w:r>
               <w:t xml:space="preserve">100% (120/120)</w:t>
@@ -464,7 +436,6 @@
           <w:p>
             <w:pPr>
               <w:pStyle w:val="Compact"/>
-              <w:jc w:val="left"/>
             </w:pPr>
             <w:r>
               <w:t xml:space="preserve">50% (20/40)</w:t>
@@ -476,7 +447,6 @@
           <w:p>
             <w:pPr>
               <w:pStyle w:val="Compact"/>
-              <w:jc w:val="left"/>
             </w:pPr>
             <w:r>
               <w:t xml:space="preserve">42% (17/40)</w:t>
@@ -490,7 +460,6 @@
           <w:p>
             <w:pPr>
               <w:pStyle w:val="Compact"/>
-              <w:jc w:val="left"/>
             </w:pPr>
             <w:r>
               <w:t xml:space="preserve">Kumru-2B</w:t>
@@ -502,7 +471,6 @@
           <w:p>
             <w:pPr>
               <w:pStyle w:val="Compact"/>
-              <w:jc w:val="left"/>
             </w:pPr>
             <w:r>
               <w:t xml:space="preserve">28% (34/120)</w:t>
@@ -514,7 +482,6 @@
           <w:p>
             <w:pPr>
               <w:pStyle w:val="Compact"/>
-              <w:jc w:val="left"/>
             </w:pPr>
             <w:r>
               <w:t xml:space="preserve">74% (89/120)</w:t>
@@ -526,7 +493,6 @@
           <w:p>
             <w:pPr>
               <w:pStyle w:val="Compact"/>
-              <w:jc w:val="left"/>
             </w:pPr>
             <w:r>
               <w:t xml:space="preserve">50% (20/40)</w:t>
@@ -538,7 +504,6 @@
           <w:p>
             <w:pPr>
               <w:pStyle w:val="Compact"/>
-              <w:jc w:val="left"/>
             </w:pPr>
             <w:r>
               <w:t xml:space="preserve">35% (14/40)</w:t>
@@ -547,8 +512,8 @@
         </w:tc>
       </w:tr>
     </w:tbl>
-    <w:bookmarkEnd w:id="20"/>
-    <w:bookmarkStart w:id="21" w:name="X5688783f941335aa0c60075f0ebb85f476c511c"/>
+    <w:bookmarkEnd w:id="9"/>
+    <w:bookmarkStart w:id="10" w:name="X5688783f941335aa0c60075f0ebb85f476c511c"/>
     <w:p>
       <w:pPr>
         <w:pStyle w:val="Heading2"/>
@@ -569,8 +534,8 @@
       <w:tblPr>
         <w:tblStyle w:val="Table"/>
         <w:tblW w:type="pct" w:w="5000"/>
+        <w:tblLayout w:type="fixed"/>
         <w:tblLook w:firstRow="1" w:lastRow="0" w:firstColumn="0" w:lastColumn="0" w:noHBand="0" w:noVBand="0" w:val="0020"/>
-        <w:jc w:val="start"/>
       </w:tblPr>
       <w:tblGrid>
         <w:gridCol w:w="1584"/>
@@ -581,14 +546,13 @@
       </w:tblGrid>
       <w:tr>
         <w:trPr>
-          <w:tblHeader w:val="true"/>
+          <w:tblHeader w:val="on"/>
         </w:trPr>
         <w:tc>
           <w:tcPr/>
           <w:p>
             <w:pPr>
               <w:pStyle w:val="Compact"/>
-              <w:jc w:val="left"/>
             </w:pPr>
             <w:r>
               <w:t xml:space="preserve">Model</w:t>
@@ -600,7 +564,6 @@
           <w:p>
             <w:pPr>
               <w:pStyle w:val="Compact"/>
-              <w:jc w:val="left"/>
             </w:pPr>
             <w:r>
               <w:t xml:space="preserve">Örtüşme RAG’sız</w:t>
@@ -612,7 +575,6 @@
           <w:p>
             <w:pPr>
               <w:pStyle w:val="Compact"/>
-              <w:jc w:val="left"/>
             </w:pPr>
             <w:r>
               <w:t xml:space="preserve">Örtüşme RAG’lı</w:t>
@@ -624,7 +586,6 @@
           <w:p>
             <w:pPr>
               <w:pStyle w:val="Compact"/>
-              <w:jc w:val="left"/>
             </w:pPr>
             <w:r>
               <w:t xml:space="preserve">Halüsinasyon RAG’sız</w:t>
@@ -636,7 +597,6 @@
           <w:p>
             <w:pPr>
               <w:pStyle w:val="Compact"/>
-              <w:jc w:val="left"/>
             </w:pPr>
             <w:r>
               <w:t xml:space="preserve">Halüsinasyon RAG’lı</w:t>
@@ -650,7 +610,6 @@
           <w:p>
             <w:pPr>
               <w:pStyle w:val="Compact"/>
-              <w:jc w:val="left"/>
             </w:pPr>
             <w:r>
               <w:t xml:space="preserve">Claude Sonnet 4.6</w:t>
@@ -662,7 +621,6 @@
           <w:p>
             <w:pPr>
               <w:pStyle w:val="Compact"/>
-              <w:jc w:val="left"/>
             </w:pPr>
             <w:r>
               <w:t xml:space="preserve">72% (101/140)</w:t>
@@ -674,7 +632,6 @@
           <w:p>
             <w:pPr>
               <w:pStyle w:val="Compact"/>
-              <w:jc w:val="left"/>
             </w:pPr>
             <w:r>
               <w:t xml:space="preserve">93% (130/140)</w:t>
@@ -686,7 +643,6 @@
           <w:p>
             <w:pPr>
               <w:pStyle w:val="Compact"/>
-              <w:jc w:val="left"/>
             </w:pPr>
             <w:r>
               <w:t xml:space="preserve">5% (7/140)</w:t>
@@ -698,7 +654,6 @@
           <w:p>
             <w:pPr>
               <w:pStyle w:val="Compact"/>
-              <w:jc w:val="left"/>
             </w:pPr>
             <w:r>
               <w:t xml:space="preserve">9% (12/140)</w:t>
@@ -712,7 +667,6 @@
           <w:p>
             <w:pPr>
               <w:pStyle w:val="Compact"/>
-              <w:jc w:val="left"/>
             </w:pPr>
             <w:r>
               <w:t xml:space="preserve">GPT-4o</w:t>
@@ -724,7 +678,6 @@
           <w:p>
             <w:pPr>
               <w:pStyle w:val="Compact"/>
-              <w:jc w:val="left"/>
             </w:pPr>
             <w:r>
               <w:t xml:space="preserve">67% (94/140)</w:t>
@@ -736,7 +689,6 @@
           <w:p>
             <w:pPr>
               <w:pStyle w:val="Compact"/>
-              <w:jc w:val="left"/>
             </w:pPr>
             <w:r>
               <w:t xml:space="preserve">93% (130/140)</w:t>
@@ -748,7 +700,6 @@
           <w:p>
             <w:pPr>
               <w:pStyle w:val="Compact"/>
-              <w:jc w:val="left"/>
             </w:pPr>
             <w:r>
               <w:t xml:space="preserve">34% (47/140)</w:t>
@@ -760,7 +711,6 @@
           <w:p>
             <w:pPr>
               <w:pStyle w:val="Compact"/>
-              <w:jc w:val="left"/>
             </w:pPr>
             <w:r>
               <w:t xml:space="preserve">7% (10/140)</w:t>
@@ -774,7 +724,6 @@
           <w:p>
             <w:pPr>
               <w:pStyle w:val="Compact"/>
-              <w:jc w:val="left"/>
             </w:pPr>
             <w:r>
               <w:t xml:space="preserve">Gemini 3.6 Flash</w:t>
@@ -786,7 +735,6 @@
           <w:p>
             <w:pPr>
               <w:pStyle w:val="Compact"/>
-              <w:jc w:val="left"/>
             </w:pPr>
             <w:r>
               <w:t xml:space="preserve">76% (106/140)</w:t>
@@ -798,7 +746,6 @@
           <w:p>
             <w:pPr>
               <w:pStyle w:val="Compact"/>
-              <w:jc w:val="left"/>
             </w:pPr>
             <w:r>
               <w:t xml:space="preserve">93% (130/140)</w:t>
@@ -810,7 +757,6 @@
           <w:p>
             <w:pPr>
               <w:pStyle w:val="Compact"/>
-              <w:jc w:val="left"/>
             </w:pPr>
             <w:r>
               <w:t xml:space="preserve">23% (32/140)</w:t>
@@ -822,7 +768,6 @@
           <w:p>
             <w:pPr>
               <w:pStyle w:val="Compact"/>
-              <w:jc w:val="left"/>
             </w:pPr>
             <w:r>
               <w:t xml:space="preserve">7% (10/140)</w:t>
@@ -836,7 +781,6 @@
           <w:p>
             <w:pPr>
               <w:pStyle w:val="Compact"/>
-              <w:jc w:val="left"/>
             </w:pPr>
             <w:r>
               <w:t xml:space="preserve">DeepSeek v4-flash</w:t>
@@ -848,7 +792,6 @@
           <w:p>
             <w:pPr>
               <w:pStyle w:val="Compact"/>
-              <w:jc w:val="left"/>
             </w:pPr>
             <w:r>
               <w:t xml:space="preserve">59% (83/140)</w:t>
@@ -860,7 +803,6 @@
           <w:p>
             <w:pPr>
               <w:pStyle w:val="Compact"/>
-              <w:jc w:val="left"/>
             </w:pPr>
             <w:r>
               <w:t xml:space="preserve">92% (129/140)</w:t>
@@ -872,7 +814,6 @@
           <w:p>
             <w:pPr>
               <w:pStyle w:val="Compact"/>
-              <w:jc w:val="left"/>
             </w:pPr>
             <w:r>
               <w:t xml:space="preserve">16% (23/140)</w:t>
@@ -884,7 +825,6 @@
           <w:p>
             <w:pPr>
               <w:pStyle w:val="Compact"/>
-              <w:jc w:val="left"/>
             </w:pPr>
             <w:r>
               <w:t xml:space="preserve">8% (11/140)</w:t>
@@ -898,7 +838,6 @@
           <w:p>
             <w:pPr>
               <w:pStyle w:val="Compact"/>
-              <w:jc w:val="left"/>
             </w:pPr>
             <w:r>
               <w:t xml:space="preserve">Grok 4.6</w:t>
@@ -910,7 +849,6 @@
           <w:p>
             <w:pPr>
               <w:pStyle w:val="Compact"/>
-              <w:jc w:val="left"/>
             </w:pPr>
             <w:r>
               <w:t xml:space="preserve">9% (13/140)</w:t>
@@ -922,7 +860,6 @@
           <w:p>
             <w:pPr>
               <w:pStyle w:val="Compact"/>
-              <w:jc w:val="left"/>
             </w:pPr>
             <w:r>
               <w:t xml:space="preserve">93% (130/140)</w:t>
@@ -934,7 +871,6 @@
           <w:p>
             <w:pPr>
               <w:pStyle w:val="Compact"/>
-              <w:jc w:val="left"/>
             </w:pPr>
             <w:r>
               <w:t xml:space="preserve">0% (0/140)</w:t>
@@ -946,7 +882,6 @@
           <w:p>
             <w:pPr>
               <w:pStyle w:val="Compact"/>
-              <w:jc w:val="left"/>
             </w:pPr>
             <w:r>
               <w:t xml:space="preserve">7% (10/140)</w:t>
@@ -960,7 +895,6 @@
           <w:p>
             <w:pPr>
               <w:pStyle w:val="Compact"/>
-              <w:jc w:val="left"/>
             </w:pPr>
             <w:r>
               <w:t xml:space="preserve">Kumru-2B</w:t>
@@ -972,7 +906,6 @@
           <w:p>
             <w:pPr>
               <w:pStyle w:val="Compact"/>
-              <w:jc w:val="left"/>
             </w:pPr>
             <w:r>
               <w:t xml:space="preserve">8% (11/140)</w:t>
@@ -984,7 +917,6 @@
           <w:p>
             <w:pPr>
               <w:pStyle w:val="Compact"/>
-              <w:jc w:val="left"/>
             </w:pPr>
             <w:r>
               <w:t xml:space="preserve">68% (95/140)</w:t>
@@ -996,7 +928,6 @@
           <w:p>
             <w:pPr>
               <w:pStyle w:val="Compact"/>
-              <w:jc w:val="left"/>
             </w:pPr>
             <w:r>
               <w:t xml:space="preserve">95% (133/140)</w:t>
@@ -1008,7 +939,6 @@
           <w:p>
             <w:pPr>
               <w:pStyle w:val="Compact"/>
-              <w:jc w:val="left"/>
             </w:pPr>
             <w:r>
               <w:t xml:space="preserve">64% (90/140)</w:t>
@@ -1017,8 +947,8 @@
         </w:tc>
       </w:tr>
     </w:tbl>
-    <w:bookmarkEnd w:id="21"/>
-    <w:bookmarkStart w:id="22" w:name="X14c4d72db889f565a84f3559ced13918594baa8"/>
+    <w:bookmarkEnd w:id="10"/>
+    <w:bookmarkStart w:id="11" w:name="X14c4d72db889f565a84f3559ced13918594baa8"/>
     <w:p>
       <w:pPr>
         <w:pStyle w:val="Heading2"/>
@@ -1038,13 +968,7 @@
         <w:t xml:space="preserve"> </w:t>
       </w:r>
       <w:r>
-        <w:t xml:space="preserve">“</w:t>
-      </w:r>
-      <w:r>
-        <w:t xml:space="preserve">Belirsiz</w:t>
-      </w:r>
-      <w:r>
-        <w:t xml:space="preserve">”</w:t>
+        <w:t xml:space="preserve">“Belirsiz”</w:t>
       </w:r>
       <w:r>
         <w:t xml:space="preserve"> </w:t>
@@ -1056,13 +980,7 @@
         <w:t xml:space="preserve"> </w:t>
       </w:r>
       <w:r>
-        <w:t xml:space="preserve">“</w:t>
-      </w:r>
-      <w:r>
-        <w:t xml:space="preserve">çözümlenemeyen</w:t>
-      </w:r>
-      <w:r>
-        <w:t xml:space="preserve">”</w:t>
+        <w:t xml:space="preserve">“çözümlenemeyen”</w:t>
       </w:r>
       <w:r>
         <w:t xml:space="preserve"> </w:t>
@@ -1075,8 +993,8 @@
       <w:tblPr>
         <w:tblStyle w:val="Table"/>
         <w:tblW w:type="pct" w:w="5000"/>
+        <w:tblLayout w:type="fixed"/>
         <w:tblLook w:firstRow="1" w:lastRow="0" w:firstColumn="0" w:lastColumn="0" w:noHBand="0" w:noVBand="0" w:val="0020"/>
-        <w:jc w:val="start"/>
       </w:tblPr>
       <w:tblGrid>
         <w:gridCol w:w="1131"/>
@@ -1089,14 +1007,13 @@
       </w:tblGrid>
       <w:tr>
         <w:trPr>
-          <w:tblHeader w:val="true"/>
+          <w:tblHeader w:val="on"/>
         </w:trPr>
         <w:tc>
           <w:tcPr/>
           <w:p>
             <w:pPr>
               <w:pStyle w:val="Compact"/>
-              <w:jc w:val="left"/>
             </w:pPr>
             <w:r>
               <w:t xml:space="preserve">Model</w:t>
@@ -1108,7 +1025,6 @@
           <w:p>
             <w:pPr>
               <w:pStyle w:val="Compact"/>
-              <w:jc w:val="left"/>
             </w:pPr>
             <w:r>
               <w:t xml:space="preserve">Koşul</w:t>
@@ -1120,7 +1036,6 @@
           <w:p>
             <w:pPr>
               <w:pStyle w:val="Compact"/>
-              <w:jc w:val="left"/>
             </w:pPr>
             <w:r>
               <w:t xml:space="preserve">I₂ yasak / çözümlenen</w:t>
@@ -1132,7 +1047,6 @@
           <w:p>
             <w:pPr>
               <w:pStyle w:val="Compact"/>
-              <w:jc w:val="left"/>
             </w:pPr>
             <w:r>
               <w:t xml:space="preserve">I₁</w:t>
@@ -1144,7 +1058,6 @@
           <w:p>
             <w:pPr>
               <w:pStyle w:val="Compact"/>
-              <w:jc w:val="left"/>
             </w:pPr>
             <w:r>
               <w:t xml:space="preserve">I₃</w:t>
@@ -1156,7 +1069,6 @@
           <w:p>
             <w:pPr>
               <w:pStyle w:val="Compact"/>
-              <w:jc w:val="left"/>
             </w:pPr>
             <w:r>
               <w:t xml:space="preserve">Belirsiz</w:t>
@@ -1168,7 +1080,6 @@
           <w:p>
             <w:pPr>
               <w:pStyle w:val="Compact"/>
-              <w:jc w:val="left"/>
             </w:pPr>
             <w:r>
               <w:t xml:space="preserve">Çözümlenemeyen</w:t>
@@ -1182,7 +1093,6 @@
           <w:p>
             <w:pPr>
               <w:pStyle w:val="Compact"/>
-              <w:jc w:val="left"/>
             </w:pPr>
             <w:r>
               <w:t xml:space="preserve">Claude Sonnet 4.6</w:t>
@@ -1194,7 +1104,6 @@
           <w:p>
             <w:pPr>
               <w:pStyle w:val="Compact"/>
-              <w:jc w:val="left"/>
             </w:pPr>
             <w:r>
               <w:t xml:space="preserve">V_kisitsiz</w:t>
@@ -1206,7 +1115,6 @@
           <w:p>
             <w:pPr>
               <w:pStyle w:val="Compact"/>
-              <w:jc w:val="left"/>
             </w:pPr>
             <w:r>
               <w:t xml:space="preserve">0% (0/160)</w:t>
@@ -1218,7 +1126,6 @@
           <w:p>
             <w:pPr>
               <w:pStyle w:val="Compact"/>
-              <w:jc w:val="left"/>
             </w:pPr>
             <w:r>
               <w:t xml:space="preserve">142</w:t>
@@ -1230,7 +1137,6 @@
           <w:p>
             <w:pPr>
               <w:pStyle w:val="Compact"/>
-              <w:jc w:val="left"/>
             </w:pPr>
             <w:r>
               <w:t xml:space="preserve">18</w:t>
@@ -1242,7 +1148,6 @@
           <w:p>
             <w:pPr>
               <w:pStyle w:val="Compact"/>
-              <w:jc w:val="left"/>
             </w:pPr>
             <w:r>
               <w:t xml:space="preserve">0</w:t>
@@ -1254,7 +1159,6 @@
           <w:p>
             <w:pPr>
               <w:pStyle w:val="Compact"/>
-              <w:jc w:val="left"/>
             </w:pPr>
             <w:r>
               <w:t xml:space="preserve">0</w:t>
@@ -1268,7 +1172,6 @@
           <w:p>
             <w:pPr>
               <w:pStyle w:val="Compact"/>
-              <w:jc w:val="left"/>
             </w:pPr>
             <w:r>
               <w:t xml:space="preserve">Claude Sonnet 4.6</w:t>
@@ -1280,7 +1183,6 @@
           <w:p>
             <w:pPr>
               <w:pStyle w:val="Compact"/>
-              <w:jc w:val="left"/>
             </w:pPr>
             <w:r>
               <w:t xml:space="preserve">V_kisitli</w:t>
@@ -1292,7 +1194,6 @@
           <w:p>
             <w:pPr>
               <w:pStyle w:val="Compact"/>
-              <w:jc w:val="left"/>
             </w:pPr>
             <w:r>
               <w:t xml:space="preserve">0% (0/160)</w:t>
@@ -1304,7 +1205,6 @@
           <w:p>
             <w:pPr>
               <w:pStyle w:val="Compact"/>
-              <w:jc w:val="left"/>
             </w:pPr>
             <w:r>
               <w:t xml:space="preserve">134</w:t>
@@ -1316,7 +1216,6 @@
           <w:p>
             <w:pPr>
               <w:pStyle w:val="Compact"/>
-              <w:jc w:val="left"/>
             </w:pPr>
             <w:r>
               <w:t xml:space="preserve">10</w:t>
@@ -1328,7 +1227,6 @@
           <w:p>
             <w:pPr>
               <w:pStyle w:val="Compact"/>
-              <w:jc w:val="left"/>
             </w:pPr>
             <w:r>
               <w:t xml:space="preserve">16</w:t>
@@ -1340,7 +1238,6 @@
           <w:p>
             <w:pPr>
               <w:pStyle w:val="Compact"/>
-              <w:jc w:val="left"/>
             </w:pPr>
             <w:r>
               <w:t xml:space="preserve">0</w:t>
@@ -1354,7 +1251,6 @@
           <w:p>
             <w:pPr>
               <w:pStyle w:val="Compact"/>
-              <w:jc w:val="left"/>
             </w:pPr>
             <w:r>
               <w:t xml:space="preserve">GPT-4o</w:t>
@@ -1366,7 +1262,6 @@
           <w:p>
             <w:pPr>
               <w:pStyle w:val="Compact"/>
-              <w:jc w:val="left"/>
             </w:pPr>
             <w:r>
               <w:t xml:space="preserve">V_kisitsiz</w:t>
@@ -1378,7 +1273,6 @@
           <w:p>
             <w:pPr>
               <w:pStyle w:val="Compact"/>
-              <w:jc w:val="left"/>
             </w:pPr>
             <w:r>
               <w:t xml:space="preserve">0% (0/160)</w:t>
@@ -1390,7 +1284,6 @@
           <w:p>
             <w:pPr>
               <w:pStyle w:val="Compact"/>
-              <w:jc w:val="left"/>
             </w:pPr>
             <w:r>
               <w:t xml:space="preserve">160</w:t>
@@ -1402,7 +1295,6 @@
           <w:p>
             <w:pPr>
               <w:pStyle w:val="Compact"/>
-              <w:jc w:val="left"/>
             </w:pPr>
             <w:r>
               <w:t xml:space="preserve">0</w:t>
@@ -1414,7 +1306,6 @@
           <w:p>
             <w:pPr>
               <w:pStyle w:val="Compact"/>
-              <w:jc w:val="left"/>
             </w:pPr>
             <w:r>
               <w:t xml:space="preserve">0</w:t>
@@ -1426,7 +1317,6 @@
           <w:p>
             <w:pPr>
               <w:pStyle w:val="Compact"/>
-              <w:jc w:val="left"/>
             </w:pPr>
             <w:r>
               <w:t xml:space="preserve">0</w:t>
@@ -1440,7 +1330,6 @@
           <w:p>
             <w:pPr>
               <w:pStyle w:val="Compact"/>
-              <w:jc w:val="left"/>
             </w:pPr>
             <w:r>
               <w:t xml:space="preserve">GPT-4o</w:t>
@@ -1452,7 +1341,6 @@
           <w:p>
             <w:pPr>
               <w:pStyle w:val="Compact"/>
-              <w:jc w:val="left"/>
             </w:pPr>
             <w:r>
               <w:t xml:space="preserve">V_kisitli</w:t>
@@ -1464,7 +1352,6 @@
           <w:p>
             <w:pPr>
               <w:pStyle w:val="Compact"/>
-              <w:jc w:val="left"/>
             </w:pPr>
             <w:r>
               <w:t xml:space="preserve">0% (0/160)</w:t>
@@ -1476,7 +1363,6 @@
           <w:p>
             <w:pPr>
               <w:pStyle w:val="Compact"/>
-              <w:jc w:val="left"/>
             </w:pPr>
             <w:r>
               <w:t xml:space="preserve">160</w:t>
@@ -1488,7 +1374,6 @@
           <w:p>
             <w:pPr>
               <w:pStyle w:val="Compact"/>
-              <w:jc w:val="left"/>
             </w:pPr>
             <w:r>
               <w:t xml:space="preserve">0</w:t>
@@ -1500,7 +1385,6 @@
           <w:p>
             <w:pPr>
               <w:pStyle w:val="Compact"/>
-              <w:jc w:val="left"/>
             </w:pPr>
             <w:r>
               <w:t xml:space="preserve">0</w:t>
@@ -1512,7 +1396,6 @@
           <w:p>
             <w:pPr>
               <w:pStyle w:val="Compact"/>
-              <w:jc w:val="left"/>
             </w:pPr>
             <w:r>
               <w:t xml:space="preserve">0</w:t>
@@ -1526,7 +1409,6 @@
           <w:p>
             <w:pPr>
               <w:pStyle w:val="Compact"/>
-              <w:jc w:val="left"/>
             </w:pPr>
             <w:r>
               <w:t xml:space="preserve">Gemini 3.6 Flash</w:t>
@@ -1538,7 +1420,6 @@
           <w:p>
             <w:pPr>
               <w:pStyle w:val="Compact"/>
-              <w:jc w:val="left"/>
             </w:pPr>
             <w:r>
               <w:t xml:space="preserve">V_kisitsiz</w:t>
@@ -1550,7 +1431,6 @@
           <w:p>
             <w:pPr>
               <w:pStyle w:val="Compact"/>
-              <w:jc w:val="left"/>
             </w:pPr>
             <w:r>
               <w:t xml:space="preserve">0% (0/160)</w:t>
@@ -1562,7 +1442,6 @@
           <w:p>
             <w:pPr>
               <w:pStyle w:val="Compact"/>
-              <w:jc w:val="left"/>
             </w:pPr>
             <w:r>
               <w:t xml:space="preserve">158</w:t>
@@ -1574,7 +1453,6 @@
           <w:p>
             <w:pPr>
               <w:pStyle w:val="Compact"/>
-              <w:jc w:val="left"/>
             </w:pPr>
             <w:r>
               <w:t xml:space="preserve">2</w:t>
@@ -1586,7 +1464,6 @@
           <w:p>
             <w:pPr>
               <w:pStyle w:val="Compact"/>
-              <w:jc w:val="left"/>
             </w:pPr>
             <w:r>
               <w:t xml:space="preserve">0</w:t>
@@ -1598,7 +1475,6 @@
           <w:p>
             <w:pPr>
               <w:pStyle w:val="Compact"/>
-              <w:jc w:val="left"/>
             </w:pPr>
             <w:r>
               <w:t xml:space="preserve">0</w:t>
@@ -1612,7 +1488,6 @@
           <w:p>
             <w:pPr>
               <w:pStyle w:val="Compact"/>
-              <w:jc w:val="left"/>
             </w:pPr>
             <w:r>
               <w:t xml:space="preserve">Gemini 3.6 Flash</w:t>
@@ -1624,7 +1499,6 @@
           <w:p>
             <w:pPr>
               <w:pStyle w:val="Compact"/>
-              <w:jc w:val="left"/>
             </w:pPr>
             <w:r>
               <w:t xml:space="preserve">V_kisitli</w:t>
@@ -1636,7 +1510,6 @@
           <w:p>
             <w:pPr>
               <w:pStyle w:val="Compact"/>
-              <w:jc w:val="left"/>
             </w:pPr>
             <w:r>
               <w:t xml:space="preserve">0% (0/160)</w:t>
@@ -1648,7 +1521,6 @@
           <w:p>
             <w:pPr>
               <w:pStyle w:val="Compact"/>
-              <w:jc w:val="left"/>
             </w:pPr>
             <w:r>
               <w:t xml:space="preserve">159</w:t>
@@ -1660,7 +1532,6 @@
           <w:p>
             <w:pPr>
               <w:pStyle w:val="Compact"/>
-              <w:jc w:val="left"/>
             </w:pPr>
             <w:r>
               <w:t xml:space="preserve">1</w:t>
@@ -1672,7 +1543,6 @@
           <w:p>
             <w:pPr>
               <w:pStyle w:val="Compact"/>
-              <w:jc w:val="left"/>
             </w:pPr>
             <w:r>
               <w:t xml:space="preserve">0</w:t>
@@ -1684,7 +1554,6 @@
           <w:p>
             <w:pPr>
               <w:pStyle w:val="Compact"/>
-              <w:jc w:val="left"/>
             </w:pPr>
             <w:r>
               <w:t xml:space="preserve">0</w:t>
@@ -1698,7 +1567,6 @@
           <w:p>
             <w:pPr>
               <w:pStyle w:val="Compact"/>
-              <w:jc w:val="left"/>
             </w:pPr>
             <w:r>
               <w:t xml:space="preserve">DeepSeek v4-flash</w:t>
@@ -1710,7 +1578,6 @@
           <w:p>
             <w:pPr>
               <w:pStyle w:val="Compact"/>
-              <w:jc w:val="left"/>
             </w:pPr>
             <w:r>
               <w:t xml:space="preserve">V_kisitsiz</w:t>
@@ -1722,7 +1589,6 @@
           <w:p>
             <w:pPr>
               <w:pStyle w:val="Compact"/>
-              <w:jc w:val="left"/>
             </w:pPr>
             <w:r>
               <w:t xml:space="preserve">0% (0/155)</w:t>
@@ -1734,7 +1600,6 @@
           <w:p>
             <w:pPr>
               <w:pStyle w:val="Compact"/>
-              <w:jc w:val="left"/>
             </w:pPr>
             <w:r>
               <w:t xml:space="preserve">136</w:t>
@@ -1746,7 +1611,6 @@
           <w:p>
             <w:pPr>
               <w:pStyle w:val="Compact"/>
-              <w:jc w:val="left"/>
             </w:pPr>
             <w:r>
               <w:t xml:space="preserve">19</w:t>
@@ -1758,7 +1622,6 @@
           <w:p>
             <w:pPr>
               <w:pStyle w:val="Compact"/>
-              <w:jc w:val="left"/>
             </w:pPr>
             <w:r>
               <w:t xml:space="preserve">0</w:t>
@@ -1770,7 +1633,6 @@
           <w:p>
             <w:pPr>
               <w:pStyle w:val="Compact"/>
-              <w:jc w:val="left"/>
             </w:pPr>
             <w:r>
               <w:t xml:space="preserve">5</w:t>
@@ -1784,7 +1646,6 @@
           <w:p>
             <w:pPr>
               <w:pStyle w:val="Compact"/>
-              <w:jc w:val="left"/>
             </w:pPr>
             <w:r>
               <w:t xml:space="preserve">DeepSeek v4-flash</w:t>
@@ -1796,7 +1657,6 @@
           <w:p>
             <w:pPr>
               <w:pStyle w:val="Compact"/>
-              <w:jc w:val="left"/>
             </w:pPr>
             <w:r>
               <w:t xml:space="preserve">V_kisitli</w:t>
@@ -1808,7 +1668,6 @@
           <w:p>
             <w:pPr>
               <w:pStyle w:val="Compact"/>
-              <w:jc w:val="left"/>
             </w:pPr>
             <w:r>
               <w:t xml:space="preserve">0% (0/127)</w:t>
@@ -1820,7 +1679,6 @@
           <w:p>
             <w:pPr>
               <w:pStyle w:val="Compact"/>
-              <w:jc w:val="left"/>
             </w:pPr>
             <w:r>
               <w:t xml:space="preserve">97</w:t>
@@ -1832,7 +1690,6 @@
           <w:p>
             <w:pPr>
               <w:pStyle w:val="Compact"/>
-              <w:jc w:val="left"/>
             </w:pPr>
             <w:r>
               <w:t xml:space="preserve">30</w:t>
@@ -1844,7 +1701,6 @@
           <w:p>
             <w:pPr>
               <w:pStyle w:val="Compact"/>
-              <w:jc w:val="left"/>
             </w:pPr>
             <w:r>
               <w:t xml:space="preserve">0</w:t>
@@ -1856,7 +1712,6 @@
           <w:p>
             <w:pPr>
               <w:pStyle w:val="Compact"/>
-              <w:jc w:val="left"/>
             </w:pPr>
             <w:r>
               <w:t xml:space="preserve">33</w:t>
@@ -1870,7 +1725,6 @@
           <w:p>
             <w:pPr>
               <w:pStyle w:val="Compact"/>
-              <w:jc w:val="left"/>
             </w:pPr>
             <w:r>
               <w:t xml:space="preserve">Grok 4.6</w:t>
@@ -1882,7 +1736,6 @@
           <w:p>
             <w:pPr>
               <w:pStyle w:val="Compact"/>
-              <w:jc w:val="left"/>
             </w:pPr>
             <w:r>
               <w:t xml:space="preserve">V_kisitsiz</w:t>
@@ -1894,7 +1747,6 @@
           <w:p>
             <w:pPr>
               <w:pStyle w:val="Compact"/>
-              <w:jc w:val="left"/>
             </w:pPr>
             <w:r>
               <w:t xml:space="preserve">0% (0/160)</w:t>
@@ -1906,7 +1758,6 @@
           <w:p>
             <w:pPr>
               <w:pStyle w:val="Compact"/>
-              <w:jc w:val="left"/>
             </w:pPr>
             <w:r>
               <w:t xml:space="preserve">152</w:t>
@@ -1918,7 +1769,6 @@
           <w:p>
             <w:pPr>
               <w:pStyle w:val="Compact"/>
-              <w:jc w:val="left"/>
             </w:pPr>
             <w:r>
               <w:t xml:space="preserve">8</w:t>
@@ -1930,7 +1780,6 @@
           <w:p>
             <w:pPr>
               <w:pStyle w:val="Compact"/>
-              <w:jc w:val="left"/>
             </w:pPr>
             <w:r>
               <w:t xml:space="preserve">0</w:t>
@@ -1942,7 +1791,6 @@
           <w:p>
             <w:pPr>
               <w:pStyle w:val="Compact"/>
-              <w:jc w:val="left"/>
             </w:pPr>
             <w:r>
               <w:t xml:space="preserve">0</w:t>
@@ -1956,7 +1804,6 @@
           <w:p>
             <w:pPr>
               <w:pStyle w:val="Compact"/>
-              <w:jc w:val="left"/>
             </w:pPr>
             <w:r>
               <w:t xml:space="preserve">Grok 4.6</w:t>
@@ -1968,7 +1815,6 @@
           <w:p>
             <w:pPr>
               <w:pStyle w:val="Compact"/>
-              <w:jc w:val="left"/>
             </w:pPr>
             <w:r>
               <w:t xml:space="preserve">V_kisitli</w:t>
@@ -1980,7 +1826,6 @@
           <w:p>
             <w:pPr>
               <w:pStyle w:val="Compact"/>
-              <w:jc w:val="left"/>
             </w:pPr>
             <w:r>
               <w:t xml:space="preserve">0% (0/160)</w:t>
@@ -1992,7 +1837,6 @@
           <w:p>
             <w:pPr>
               <w:pStyle w:val="Compact"/>
-              <w:jc w:val="left"/>
             </w:pPr>
             <w:r>
               <w:t xml:space="preserve">154</w:t>
@@ -2004,7 +1848,6 @@
           <w:p>
             <w:pPr>
               <w:pStyle w:val="Compact"/>
-              <w:jc w:val="left"/>
             </w:pPr>
             <w:r>
               <w:t xml:space="preserve">6</w:t>
@@ -2016,7 +1859,6 @@
           <w:p>
             <w:pPr>
               <w:pStyle w:val="Compact"/>
-              <w:jc w:val="left"/>
             </w:pPr>
             <w:r>
               <w:t xml:space="preserve">0</w:t>
@@ -2028,7 +1870,6 @@
           <w:p>
             <w:pPr>
               <w:pStyle w:val="Compact"/>
-              <w:jc w:val="left"/>
             </w:pPr>
             <w:r>
               <w:t xml:space="preserve">0</w:t>
@@ -2042,7 +1883,6 @@
           <w:p>
             <w:pPr>
               <w:pStyle w:val="Compact"/>
-              <w:jc w:val="left"/>
             </w:pPr>
             <w:r>
               <w:t xml:space="preserve">Kumru-2B</w:t>
@@ -2054,7 +1894,6 @@
           <w:p>
             <w:pPr>
               <w:pStyle w:val="Compact"/>
-              <w:jc w:val="left"/>
             </w:pPr>
             <w:r>
               <w:t xml:space="preserve">V_kisitsiz</w:t>
@@ -2066,7 +1905,6 @@
           <w:p>
             <w:pPr>
               <w:pStyle w:val="Compact"/>
-              <w:jc w:val="left"/>
             </w:pPr>
             <w:r>
               <w:t xml:space="preserve">0% (0/31)</w:t>
@@ -2078,7 +1916,6 @@
           <w:p>
             <w:pPr>
               <w:pStyle w:val="Compact"/>
-              <w:jc w:val="left"/>
             </w:pPr>
             <w:r>
               <w:t xml:space="preserve">23</w:t>
@@ -2090,7 +1927,6 @@
           <w:p>
             <w:pPr>
               <w:pStyle w:val="Compact"/>
-              <w:jc w:val="left"/>
             </w:pPr>
             <w:r>
               <w:t xml:space="preserve">7</w:t>
@@ -2102,7 +1938,6 @@
           <w:p>
             <w:pPr>
               <w:pStyle w:val="Compact"/>
-              <w:jc w:val="left"/>
             </w:pPr>
             <w:r>
               <w:t xml:space="preserve">1</w:t>
@@ -2114,7 +1949,6 @@
           <w:p>
             <w:pPr>
               <w:pStyle w:val="Compact"/>
-              <w:jc w:val="left"/>
             </w:pPr>
             <w:r>
               <w:t xml:space="preserve">129</w:t>
@@ -2128,7 +1962,6 @@
           <w:p>
             <w:pPr>
               <w:pStyle w:val="Compact"/>
-              <w:jc w:val="left"/>
             </w:pPr>
             <w:r>
               <w:t xml:space="preserve">Kumru-2B</w:t>
@@ -2140,7 +1973,6 @@
           <w:p>
             <w:pPr>
               <w:pStyle w:val="Compact"/>
-              <w:jc w:val="left"/>
             </w:pPr>
             <w:r>
               <w:t xml:space="preserve">V_kisitli</w:t>
@@ -2152,7 +1984,6 @@
           <w:p>
             <w:pPr>
               <w:pStyle w:val="Compact"/>
-              <w:jc w:val="left"/>
             </w:pPr>
             <w:r>
               <w:t xml:space="preserve">0% (0/6)</w:t>
@@ -2164,7 +1995,6 @@
           <w:p>
             <w:pPr>
               <w:pStyle w:val="Compact"/>
-              <w:jc w:val="left"/>
             </w:pPr>
             <w:r>
               <w:t xml:space="preserve">4</w:t>
@@ -2176,7 +2006,6 @@
           <w:p>
             <w:pPr>
               <w:pStyle w:val="Compact"/>
-              <w:jc w:val="left"/>
             </w:pPr>
             <w:r>
               <w:t xml:space="preserve">1</w:t>
@@ -2188,7 +2017,6 @@
           <w:p>
             <w:pPr>
               <w:pStyle w:val="Compact"/>
-              <w:jc w:val="left"/>
             </w:pPr>
             <w:r>
               <w:t xml:space="preserve">1</w:t>
@@ -2200,7 +2028,6 @@
           <w:p>
             <w:pPr>
               <w:pStyle w:val="Compact"/>
-              <w:jc w:val="left"/>
             </w:pPr>
             <w:r>
               <w:t xml:space="preserve">154</w:t>
@@ -2209,8 +2036,8 @@
         </w:tc>
       </w:tr>
     </w:tbl>
-    <w:bookmarkEnd w:id="22"/>
-    <w:bookmarkStart w:id="23" w:name="Xdf43c876cefa1e1bb5f74ba9eddc3fd7f6c7069"/>
+    <w:bookmarkEnd w:id="11"/>
+    <w:bookmarkStart w:id="12" w:name="Xdf43c876cefa1e1bb5f74ba9eddc3fd7f6c7069"/>
     <w:p>
       <w:pPr>
         <w:pStyle w:val="Heading2"/>
@@ -2231,8 +2058,8 @@
       <w:tblPr>
         <w:tblStyle w:val="Table"/>
         <w:tblW w:type="pct" w:w="5000"/>
+        <w:tblLayout w:type="fixed"/>
         <w:tblLook w:firstRow="1" w:lastRow="0" w:firstColumn="0" w:lastColumn="0" w:noHBand="0" w:noVBand="0" w:val="0020"/>
-        <w:jc w:val="start"/>
       </w:tblPr>
       <w:tblGrid>
         <w:gridCol w:w="1584"/>
@@ -2243,14 +2070,13 @@
       </w:tblGrid>
       <w:tr>
         <w:trPr>
-          <w:tblHeader w:val="true"/>
+          <w:tblHeader w:val="on"/>
         </w:trPr>
         <w:tc>
           <w:tcPr/>
           <w:p>
             <w:pPr>
               <w:pStyle w:val="Compact"/>
-              <w:jc w:val="left"/>
             </w:pPr>
             <w:r>
               <w:t xml:space="preserve">Model</w:t>
@@ -2262,7 +2088,6 @@
           <w:p>
             <w:pPr>
               <w:pStyle w:val="Compact"/>
-              <w:jc w:val="left"/>
             </w:pPr>
             <w:r>
               <w:t xml:space="preserve">Tahdidî/maskesiz (hata)</w:t>
@@ -2274,7 +2099,6 @@
           <w:p>
             <w:pPr>
               <w:pStyle w:val="Compact"/>
-              <w:jc w:val="left"/>
             </w:pPr>
             <w:r>
               <w:t xml:space="preserve">Tahdidî/maskeli (hata)</w:t>
@@ -2286,7 +2110,6 @@
           <w:p>
             <w:pPr>
               <w:pStyle w:val="Compact"/>
-              <w:jc w:val="left"/>
             </w:pPr>
             <w:r>
               <w:t xml:space="preserve">Tadadî/maskesiz (doğru)</w:t>
@@ -2298,7 +2121,6 @@
           <w:p>
             <w:pPr>
               <w:pStyle w:val="Compact"/>
-              <w:jc w:val="left"/>
             </w:pPr>
             <w:r>
               <w:t xml:space="preserve">Tadadî/maskeli (doğru)</w:t>
@@ -2312,7 +2134,6 @@
           <w:p>
             <w:pPr>
               <w:pStyle w:val="Compact"/>
-              <w:jc w:val="left"/>
             </w:pPr>
             <w:r>
               <w:t xml:space="preserve">Claude Sonnet 4.6</w:t>
@@ -2324,7 +2145,6 @@
           <w:p>
             <w:pPr>
               <w:pStyle w:val="Compact"/>
-              <w:jc w:val="left"/>
             </w:pPr>
             <w:r>
               <w:t xml:space="preserve">10% (10/100)</w:t>
@@ -2336,7 +2156,6 @@
           <w:p>
             <w:pPr>
               <w:pStyle w:val="Compact"/>
-              <w:jc w:val="left"/>
             </w:pPr>
             <w:r>
               <w:t xml:space="preserve">8% (8/100)</w:t>
@@ -2348,7 +2167,6 @@
           <w:p>
             <w:pPr>
               <w:pStyle w:val="Compact"/>
-              <w:jc w:val="left"/>
             </w:pPr>
             <w:r>
               <w:t xml:space="preserve">58% (58/100)</w:t>
@@ -2360,7 +2178,6 @@
           <w:p>
             <w:pPr>
               <w:pStyle w:val="Compact"/>
-              <w:jc w:val="left"/>
             </w:pPr>
             <w:r>
               <w:t xml:space="preserve">76% (76/100)</w:t>
@@ -2374,7 +2191,6 @@
           <w:p>
             <w:pPr>
               <w:pStyle w:val="Compact"/>
-              <w:jc w:val="left"/>
             </w:pPr>
             <w:r>
               <w:t xml:space="preserve">GPT-4o</w:t>
@@ -2386,7 +2202,6 @@
           <w:p>
             <w:pPr>
               <w:pStyle w:val="Compact"/>
-              <w:jc w:val="left"/>
             </w:pPr>
             <w:r>
               <w:t xml:space="preserve">27% (27/100)</w:t>
@@ -2398,7 +2213,6 @@
           <w:p>
             <w:pPr>
               <w:pStyle w:val="Compact"/>
-              <w:jc w:val="left"/>
             </w:pPr>
             <w:r>
               <w:t xml:space="preserve">6% (6/100)</w:t>
@@ -2410,7 +2224,6 @@
           <w:p>
             <w:pPr>
               <w:pStyle w:val="Compact"/>
-              <w:jc w:val="left"/>
             </w:pPr>
             <w:r>
               <w:t xml:space="preserve">80% (80/100)</w:t>
@@ -2422,7 +2235,6 @@
           <w:p>
             <w:pPr>
               <w:pStyle w:val="Compact"/>
-              <w:jc w:val="left"/>
             </w:pPr>
             <w:r>
               <w:t xml:space="preserve">91% (91/100)</w:t>
@@ -2436,7 +2248,6 @@
           <w:p>
             <w:pPr>
               <w:pStyle w:val="Compact"/>
-              <w:jc w:val="left"/>
             </w:pPr>
             <w:r>
               <w:t xml:space="preserve">Gemini 3.6 Flash</w:t>
@@ -2448,7 +2259,6 @@
           <w:p>
             <w:pPr>
               <w:pStyle w:val="Compact"/>
-              <w:jc w:val="left"/>
             </w:pPr>
             <w:r>
               <w:t xml:space="preserve">17% (17/100)</w:t>
@@ -2460,7 +2270,6 @@
           <w:p>
             <w:pPr>
               <w:pStyle w:val="Compact"/>
-              <w:jc w:val="left"/>
             </w:pPr>
             <w:r>
               <w:t xml:space="preserve">10% (10/100)</w:t>
@@ -2472,7 +2281,6 @@
           <w:p>
             <w:pPr>
               <w:pStyle w:val="Compact"/>
-              <w:jc w:val="left"/>
             </w:pPr>
             <w:r>
               <w:t xml:space="preserve">83% (83/100)</w:t>
@@ -2484,7 +2292,6 @@
           <w:p>
             <w:pPr>
               <w:pStyle w:val="Compact"/>
-              <w:jc w:val="left"/>
             </w:pPr>
             <w:r>
               <w:t xml:space="preserve">92% (92/100)</w:t>
@@ -2498,7 +2305,6 @@
           <w:p>
             <w:pPr>
               <w:pStyle w:val="Compact"/>
-              <w:jc w:val="left"/>
             </w:pPr>
             <w:r>
               <w:t xml:space="preserve">DeepSeek v4-flash</w:t>
@@ -2510,7 +2316,6 @@
           <w:p>
             <w:pPr>
               <w:pStyle w:val="Compact"/>
-              <w:jc w:val="left"/>
             </w:pPr>
             <w:r>
               <w:t xml:space="preserve">24% (24/99) [1 çözümlenemeyen]</w:t>
@@ -2522,7 +2327,6 @@
           <w:p>
             <w:pPr>
               <w:pStyle w:val="Compact"/>
-              <w:jc w:val="left"/>
             </w:pPr>
             <w:r>
               <w:t xml:space="preserve">6% (6/100)</w:t>
@@ -2534,7 +2338,6 @@
           <w:p>
             <w:pPr>
               <w:pStyle w:val="Compact"/>
-              <w:jc w:val="left"/>
             </w:pPr>
             <w:r>
               <w:t xml:space="preserve">67% (67/100)</w:t>
@@ -2546,7 +2349,6 @@
           <w:p>
             <w:pPr>
               <w:pStyle w:val="Compact"/>
-              <w:jc w:val="left"/>
             </w:pPr>
             <w:r>
               <w:t xml:space="preserve">75% (73/97) [3 çözümlenemeyen]</w:t>
@@ -2560,7 +2362,6 @@
           <w:p>
             <w:pPr>
               <w:pStyle w:val="Compact"/>
-              <w:jc w:val="left"/>
             </w:pPr>
             <w:r>
               <w:t xml:space="preserve">Grok 4.6</w:t>
@@ -2572,7 +2373,6 @@
           <w:p>
             <w:pPr>
               <w:pStyle w:val="Compact"/>
-              <w:jc w:val="left"/>
             </w:pPr>
             <w:r>
               <w:t xml:space="preserve">13% (13/100)</w:t>
@@ -2584,7 +2384,6 @@
           <w:p>
             <w:pPr>
               <w:pStyle w:val="Compact"/>
-              <w:jc w:val="left"/>
             </w:pPr>
             <w:r>
               <w:t xml:space="preserve">10% (10/100)</w:t>
@@ -2596,7 +2395,6 @@
           <w:p>
             <w:pPr>
               <w:pStyle w:val="Compact"/>
-              <w:jc w:val="left"/>
             </w:pPr>
             <w:r>
               <w:t xml:space="preserve">56% (56/100)</w:t>
@@ -2608,7 +2406,6 @@
           <w:p>
             <w:pPr>
               <w:pStyle w:val="Compact"/>
-              <w:jc w:val="left"/>
             </w:pPr>
             <w:r>
               <w:t xml:space="preserve">68% (68/100)</w:t>
@@ -2622,7 +2419,6 @@
           <w:p>
             <w:pPr>
               <w:pStyle w:val="Compact"/>
-              <w:jc w:val="left"/>
             </w:pPr>
             <w:r>
               <w:t xml:space="preserve">Kumru-2B</w:t>
@@ -2634,7 +2430,6 @@
           <w:p>
             <w:pPr>
               <w:pStyle w:val="Compact"/>
-              <w:jc w:val="left"/>
             </w:pPr>
             <w:r>
               <w:t xml:space="preserve">76% (75/99) [1 çözümlenemeyen]</w:t>
@@ -2646,7 +2441,6 @@
           <w:p>
             <w:pPr>
               <w:pStyle w:val="Compact"/>
-              <w:jc w:val="left"/>
             </w:pPr>
             <w:r>
               <w:t xml:space="preserve">51% (47/93) [7 çözümlenemeyen]</w:t>
@@ -2658,7 +2452,6 @@
           <w:p>
             <w:pPr>
               <w:pStyle w:val="Compact"/>
-              <w:jc w:val="left"/>
             </w:pPr>
             <w:r>
               <w:t xml:space="preserve">96% (95/99) [1 çözümlenemeyen]</w:t>
@@ -2670,7 +2463,6 @@
           <w:p>
             <w:pPr>
               <w:pStyle w:val="Compact"/>
-              <w:jc w:val="left"/>
             </w:pPr>
             <w:r>
               <w:t xml:space="preserve">72% (68/95) [5 çözümlenemeyen]</w:t>
@@ -2679,8 +2471,8 @@
         </w:tc>
       </w:tr>
     </w:tbl>
-    <w:bookmarkEnd w:id="23"/>
-    <w:bookmarkStart w:id="24" w:name="X0c976036830ee288abbe8613ab27d918d05c3bc"/>
+    <w:bookmarkEnd w:id="12"/>
+    <w:bookmarkStart w:id="13" w:name="X0c976036830ee288abbe8613ab27d918d05c3bc"/>
     <w:p>
       <w:pPr>
         <w:pStyle w:val="Heading2"/>
@@ -2701,8 +2493,8 @@
       <w:tblPr>
         <w:tblStyle w:val="Table"/>
         <w:tblW w:type="pct" w:w="5000"/>
+        <w:tblLayout w:type="fixed"/>
         <w:tblLook w:firstRow="1" w:lastRow="0" w:firstColumn="0" w:lastColumn="0" w:noHBand="0" w:noVBand="0" w:val="0020"/>
-        <w:jc w:val="start"/>
       </w:tblPr>
       <w:tblGrid>
         <w:gridCol w:w="1320"/>
@@ -2714,14 +2506,13 @@
       </w:tblGrid>
       <w:tr>
         <w:trPr>
-          <w:tblHeader w:val="true"/>
+          <w:tblHeader w:val="on"/>
         </w:trPr>
         <w:tc>
           <w:tcPr/>
           <w:p>
             <w:pPr>
               <w:pStyle w:val="Compact"/>
-              <w:jc w:val="left"/>
             </w:pPr>
             <w:r>
               <w:t xml:space="preserve">Yargıç</w:t>
@@ -2733,7 +2524,6 @@
           <w:p>
             <w:pPr>
               <w:pStyle w:val="Compact"/>
-              <w:jc w:val="left"/>
             </w:pPr>
             <w:r>
               <w:t xml:space="preserve">Etiket doğruluğu</w:t>
@@ -2745,7 +2535,6 @@
           <w:p>
             <w:pPr>
               <w:pStyle w:val="Compact"/>
-              <w:jc w:val="left"/>
             </w:pPr>
             <w:r>
               <w:t xml:space="preserve">F=1 → OLGU_ALANI</w:t>
@@ -2757,7 +2546,6 @@
           <w:p>
             <w:pPr>
               <w:pStyle w:val="Compact"/>
-              <w:jc w:val="left"/>
             </w:pPr>
             <w:r>
               <w:t xml:space="preserve">Ortalama Ω</w:t>
@@ -2769,7 +2557,6 @@
           <w:p>
             <w:pPr>
               <w:pStyle w:val="Compact"/>
-              <w:jc w:val="left"/>
             </w:pPr>
             <w:r>
               <w:t xml:space="preserve">Senaryo içi Ω sd</w:t>
@@ -2781,7 +2568,6 @@
           <w:p>
             <w:pPr>
               <w:pStyle w:val="Compact"/>
-              <w:jc w:val="left"/>
             </w:pPr>
             <w:r>
               <w:t xml:space="preserve">Uyumsuzluk dağılımı</w:t>
@@ -2795,7 +2581,6 @@
           <w:p>
             <w:pPr>
               <w:pStyle w:val="Compact"/>
-              <w:jc w:val="left"/>
             </w:pPr>
             <w:r>
               <w:t xml:space="preserve">claude-sonnet-4-6</w:t>
@@ -2807,7 +2592,6 @@
           <w:p>
             <w:pPr>
               <w:pStyle w:val="Compact"/>
-              <w:jc w:val="left"/>
             </w:pPr>
             <w:r>
               <w:t xml:space="preserve">73% (110/150)</w:t>
@@ -2819,7 +2603,6 @@
           <w:p>
             <w:pPr>
               <w:pStyle w:val="Compact"/>
-              <w:jc w:val="left"/>
             </w:pPr>
             <w:r>
               <w:t xml:space="preserve">30/30</w:t>
@@ -2831,7 +2614,6 @@
           <w:p>
             <w:pPr>
               <w:pStyle w:val="Compact"/>
-              <w:jc w:val="left"/>
             </w:pPr>
             <w:r>
               <w:t xml:space="preserve">0.622</w:t>
@@ -2843,7 +2625,6 @@
           <w:p>
             <w:pPr>
               <w:pStyle w:val="Compact"/>
-              <w:jc w:val="left"/>
             </w:pPr>
             <w:r>
               <w:t xml:space="preserve">0.007</w:t>
@@ -2855,7 +2636,6 @@
           <w:p>
             <w:pPr>
               <w:pStyle w:val="Compact"/>
-              <w:jc w:val="left"/>
             </w:pPr>
             <w:r>
               <w:t xml:space="preserve">YORUM_ALANI→YOGUN_INCELEME: 40</w:t>
@@ -2869,7 +2649,6 @@
           <w:p>
             <w:pPr>
               <w:pStyle w:val="Compact"/>
-              <w:jc w:val="left"/>
             </w:pPr>
             <w:r>
               <w:t xml:space="preserve">gpt-4o</w:t>
@@ -2881,7 +2660,6 @@
           <w:p>
             <w:pPr>
               <w:pStyle w:val="Compact"/>
-              <w:jc w:val="left"/>
             </w:pPr>
             <w:r>
               <w:t xml:space="preserve">72% (108/150)</w:t>
@@ -2893,7 +2671,6 @@
           <w:p>
             <w:pPr>
               <w:pStyle w:val="Compact"/>
-              <w:jc w:val="left"/>
             </w:pPr>
             <w:r>
               <w:t xml:space="preserve">30/30</w:t>
@@ -2905,7 +2682,6 @@
           <w:p>
             <w:pPr>
               <w:pStyle w:val="Compact"/>
-              <w:jc w:val="left"/>
             </w:pPr>
             <w:r>
               <w:t xml:space="preserve">0.690</w:t>
@@ -2917,7 +2693,6 @@
           <w:p>
             <w:pPr>
               <w:pStyle w:val="Compact"/>
-              <w:jc w:val="left"/>
             </w:pPr>
             <w:r>
               <w:t xml:space="preserve">0.014</w:t>
@@ -2929,7 +2704,6 @@
           <w:p>
             <w:pPr>
               <w:pStyle w:val="Compact"/>
-              <w:jc w:val="left"/>
             </w:pPr>
             <w:r>
               <w:t xml:space="preserve">YORUM_ALANI→YOGUN_INCELEME: 40; SERBEST_ALAN→YORUM_ALANI: 2</w:t>
@@ -2955,8 +2729,8 @@
         <w:t xml:space="preserve">).</w:t>
       </w:r>
     </w:p>
-    <w:bookmarkEnd w:id="24"/>
-    <w:bookmarkStart w:id="25" w:name="Xc4f367e3c0c64877e6e4d6022182fc6c3102848"/>
+    <w:bookmarkEnd w:id="13"/>
+    <w:bookmarkStart w:id="14" w:name="Xc4f367e3c0c64877e6e4d6022182fc6c3102848"/>
     <w:p>
       <w:pPr>
         <w:pStyle w:val="Heading2"/>
@@ -2969,8 +2743,8 @@
       <w:tblPr>
         <w:tblStyle w:val="Table"/>
         <w:tblW w:type="pct" w:w="5000"/>
+        <w:tblLayout w:type="fixed"/>
         <w:tblLook w:firstRow="1" w:lastRow="0" w:firstColumn="0" w:lastColumn="0" w:noHBand="0" w:noVBand="0" w:val="0020"/>
-        <w:jc w:val="start"/>
       </w:tblPr>
       <w:tblGrid>
         <w:gridCol w:w="1131"/>
@@ -2983,14 +2757,13 @@
       </w:tblGrid>
       <w:tr>
         <w:trPr>
-          <w:tblHeader w:val="true"/>
+          <w:tblHeader w:val="on"/>
         </w:trPr>
         <w:tc>
           <w:tcPr/>
           <w:p>
             <w:pPr>
               <w:pStyle w:val="Compact"/>
-              <w:jc w:val="left"/>
             </w:pPr>
             <w:r>
               <w:t xml:space="preserve">Sağlayıcı</w:t>
@@ -3002,7 +2775,6 @@
           <w:p>
             <w:pPr>
               <w:pStyle w:val="Compact"/>
-              <w:jc w:val="left"/>
             </w:pPr>
             <w:r>
               <w:t xml:space="preserve">Kapalı lâfzî (n=8)</w:t>
@@ -3014,7 +2786,6 @@
           <w:p>
             <w:pPr>
               <w:pStyle w:val="Compact"/>
-              <w:jc w:val="left"/>
             </w:pPr>
             <w:r>
               <w:t xml:space="preserve">Açık lâfzî (n=6)</w:t>
@@ -3026,7 +2797,6 @@
           <w:p>
             <w:pPr>
               <w:pStyle w:val="Compact"/>
-              <w:jc w:val="left"/>
             </w:pPr>
             <w:r>
               <w:t xml:space="preserve">Kontrol (n=6)</w:t>
@@ -3038,7 +2808,6 @@
           <w:p>
             <w:pPr>
               <w:pStyle w:val="Compact"/>
-              <w:jc w:val="left"/>
             </w:pPr>
             <w:r>
               <w:t xml:space="preserve">U</w:t>
@@ -3050,7 +2819,6 @@
           <w:p>
             <w:pPr>
               <w:pStyle w:val="Compact"/>
-              <w:jc w:val="left"/>
             </w:pPr>
             <w:r>
               <w:t xml:space="preserve">p (tek yönlü, kesin)</w:t>
@@ -3062,7 +2830,6 @@
           <w:p>
             <w:pPr>
               <w:pStyle w:val="Compact"/>
-              <w:jc w:val="left"/>
             </w:pPr>
             <w:r>
               <w:t xml:space="preserve">Lâfzî maks / kontrol min</w:t>
@@ -3076,7 +2843,6 @@
           <w:p>
             <w:pPr>
               <w:pStyle w:val="Compact"/>
-              <w:jc w:val="left"/>
             </w:pPr>
             <w:r>
               <w:t xml:space="preserve">gemini</w:t>
@@ -3088,7 +2854,6 @@
           <w:p>
             <w:pPr>
               <w:pStyle w:val="Compact"/>
-              <w:jc w:val="left"/>
             </w:pPr>
             <w:r>
               <w:t xml:space="preserve">0.701</w:t>
@@ -3100,7 +2865,6 @@
           <w:p>
             <w:pPr>
               <w:pStyle w:val="Compact"/>
-              <w:jc w:val="left"/>
             </w:pPr>
             <w:r>
               <w:t xml:space="preserve">0.690</w:t>
@@ -3112,7 +2876,6 @@
           <w:p>
             <w:pPr>
               <w:pStyle w:val="Compact"/>
-              <w:jc w:val="left"/>
             </w:pPr>
             <w:r>
               <w:t xml:space="preserve">0.793</w:t>
@@ -3124,7 +2887,6 @@
           <w:p>
             <w:pPr>
               <w:pStyle w:val="Compact"/>
-              <w:jc w:val="left"/>
             </w:pPr>
             <w:r>
               <w:t xml:space="preserve">77.0</w:t>
@@ -3136,7 +2898,6 @@
           <w:p>
             <w:pPr>
               <w:pStyle w:val="Compact"/>
-              <w:jc w:val="left"/>
             </w:pPr>
             <w:r>
               <w:t xml:space="preserve">0.001135</w:t>
@@ -3148,7 +2909,6 @@
           <w:p>
             <w:pPr>
               <w:pStyle w:val="Compact"/>
-              <w:jc w:val="left"/>
             </w:pPr>
             <w:r>
               <w:t xml:space="preserve">0.777 / 0.709</w:t>
@@ -3162,7 +2922,6 @@
           <w:p>
             <w:pPr>
               <w:pStyle w:val="Compact"/>
-              <w:jc w:val="left"/>
             </w:pPr>
             <w:r>
               <w:t xml:space="preserve">kumru</w:t>
@@ -3174,7 +2933,6 @@
           <w:p>
             <w:pPr>
               <w:pStyle w:val="Compact"/>
-              <w:jc w:val="left"/>
             </w:pPr>
             <w:r>
               <w:t xml:space="preserve">0.512</w:t>
@@ -3186,7 +2944,6 @@
           <w:p>
             <w:pPr>
               <w:pStyle w:val="Compact"/>
-              <w:jc w:val="left"/>
             </w:pPr>
             <w:r>
               <w:t xml:space="preserve">0.497</w:t>
@@ -3198,7 +2955,6 @@
           <w:p>
             <w:pPr>
               <w:pStyle w:val="Compact"/>
-              <w:jc w:val="left"/>
             </w:pPr>
             <w:r>
               <w:t xml:space="preserve">0.800</w:t>
@@ -3210,7 +2966,6 @@
           <w:p>
             <w:pPr>
               <w:pStyle w:val="Compact"/>
-              <w:jc w:val="left"/>
             </w:pPr>
             <w:r>
               <w:t xml:space="preserve">84.0</w:t>
@@ -3222,7 +2977,6 @@
           <w:p>
             <w:pPr>
               <w:pStyle w:val="Compact"/>
-              <w:jc w:val="left"/>
             </w:pPr>
             <w:r>
               <w:t xml:space="preserve">2.58e-05</w:t>
@@ -3234,7 +2988,6 @@
           <w:p>
             <w:pPr>
               <w:pStyle w:val="Compact"/>
-              <w:jc w:val="left"/>
             </w:pPr>
             <w:r>
               <w:t xml:space="preserve">0.588 / 0.739</w:t>
@@ -3248,7 +3001,6 @@
           <w:p>
             <w:pPr>
               <w:pStyle w:val="Compact"/>
-              <w:jc w:val="left"/>
             </w:pPr>
             <w:r>
               <w:t xml:space="preserve">openai</w:t>
@@ -3260,7 +3012,6 @@
           <w:p>
             <w:pPr>
               <w:pStyle w:val="Compact"/>
-              <w:jc w:val="left"/>
             </w:pPr>
             <w:r>
               <w:t xml:space="preserve">0.429</w:t>
@@ -3272,7 +3023,6 @@
           <w:p>
             <w:pPr>
               <w:pStyle w:val="Compact"/>
-              <w:jc w:val="left"/>
             </w:pPr>
             <w:r>
               <w:t xml:space="preserve">0.444</w:t>
@@ -3284,7 +3034,6 @@
           <w:p>
             <w:pPr>
               <w:pStyle w:val="Compact"/>
-              <w:jc w:val="left"/>
             </w:pPr>
             <w:r>
               <w:t xml:space="preserve">0.667</w:t>
@@ -3296,7 +3045,6 @@
           <w:p>
             <w:pPr>
               <w:pStyle w:val="Compact"/>
-              <w:jc w:val="left"/>
             </w:pPr>
             <w:r>
               <w:t xml:space="preserve">82.0</w:t>
@@ -3308,7 +3056,6 @@
           <w:p>
             <w:pPr>
               <w:pStyle w:val="Compact"/>
-              <w:jc w:val="left"/>
             </w:pPr>
             <w:r>
               <w:t xml:space="preserve">0.0001032</w:t>
@@ -3320,7 +3067,6 @@
           <w:p>
             <w:pPr>
               <w:pStyle w:val="Compact"/>
-              <w:jc w:val="left"/>
             </w:pPr>
             <w:r>
               <w:t xml:space="preserve">0.575 / 0.544</w:t>
@@ -3329,9 +3075,13 @@
         </w:tc>
       </w:tr>
     </w:tbl>
-    <w:bookmarkEnd w:id="25"/>
-    <w:bookmarkEnd w:id="26"/>
-    <w:sectPr/>
+    <w:bookmarkEnd w:id="14"/>
+    <w:bookmarkEnd w:id="15"/>
+    <w:sectPr>
+      <w:footnotePr>
+        <w:numRestart w:val="eachSect"/>
+      </w:footnotePr>
+    </w:sectPr>
   </w:body>
 </w:document>
 </file>
@@ -3362,14 +3112,14 @@
 <file path=word/numbering.xml><?xml version="1.0" encoding="utf-8"?>
 <w:numbering xmlns:w="http://schemas.openxmlformats.org/wordprocessingml/2006/main">
   <w:abstractNum w:abstractNumId="990">
-    <w:nsid w:val="A990"/>
+    <w:nsid w:val="0000A990"/>
     <w:multiLevelType w:val="multilevel"/>
     <w:lvl w:ilvl="0">
       <w:numFmt w:val="bullet"/>
       <w:lvlText w:val=" "/>
       <w:lvlJc w:val="left"/>
       <w:pPr>
-        <w:ind w:left="720" w:hanging="480"/>
+        <w:ind w:left="720" w:hanging="360"/>
       </w:pPr>
     </w:lvl>
     <w:lvl w:ilvl="1">
@@ -3377,7 +3127,7 @@
       <w:lvlText w:val=" "/>
       <w:lvlJc w:val="left"/>
       <w:pPr>
-        <w:ind w:left="1440" w:hanging="480"/>
+        <w:ind w:left="1440" w:hanging="360"/>
       </w:pPr>
     </w:lvl>
     <w:lvl w:ilvl="2">
@@ -3385,7 +3135,7 @@
       <w:lvlText w:val=" "/>
       <w:lvlJc w:val="left"/>
       <w:pPr>
-        <w:ind w:left="2160" w:hanging="480"/>
+        <w:ind w:left="2160" w:hanging="360"/>
       </w:pPr>
     </w:lvl>
     <w:lvl w:ilvl="3">
@@ -3393,7 +3143,7 @@
       <w:lvlText w:val=" "/>
       <w:lvlJc w:val="left"/>
       <w:pPr>
-        <w:ind w:left="2880" w:hanging="480"/>
+        <w:ind w:left="2880" w:hanging="360"/>
       </w:pPr>
     </w:lvl>
     <w:lvl w:ilvl="4">
@@ -3401,7 +3151,7 @@
       <w:lvlText w:val=" "/>
       <w:lvlJc w:val="left"/>
       <w:pPr>
-        <w:ind w:left="3600" w:hanging="480"/>
+        <w:ind w:left="3600" w:hanging="360"/>
       </w:pPr>
     </w:lvl>
     <w:lvl w:ilvl="5">
@@ -3409,7 +3159,7 @@
       <w:lvlText w:val=" "/>
       <w:lvlJc w:val="left"/>
       <w:pPr>
-        <w:ind w:left="4320" w:hanging="480"/>
+        <w:ind w:left="4320" w:hanging="360"/>
       </w:pPr>
     </w:lvl>
     <w:lvl w:ilvl="6">
@@ -3417,7 +3167,7 @@
       <w:lvlText w:val=" "/>
       <w:lvlJc w:val="left"/>
       <w:pPr>
-        <w:ind w:left="5040" w:hanging="480"/>
+        <w:ind w:left="5040" w:hanging="360"/>
       </w:pPr>
     </w:lvl>
     <w:lvl w:ilvl="7">
@@ -3425,7 +3175,7 @@
       <w:lvlText w:val=" "/>
       <w:lvlJc w:val="left"/>
       <w:pPr>
-        <w:ind w:left="5760" w:hanging="480"/>
+        <w:ind w:left="5760" w:hanging="360"/>
       </w:pPr>
     </w:lvl>
     <w:lvl w:ilvl="8">
@@ -3433,7 +3183,7 @@
       <w:lvlText w:val=" "/>
       <w:lvlJc w:val="left"/>
       <w:pPr>
-        <w:ind w:left="6480" w:hanging="480"/>
+        <w:ind w:left="6480" w:hanging="360"/>
       </w:pPr>
     </w:lvl>
   </w:abstractNum>
@@ -3448,10 +3198,10 @@
   <w:docDefaults>
     <w:rPrDefault>
       <w:rPr>
-        <w:rFonts w:asciiTheme="minorHAnsi" w:cstheme="minorBidi" w:eastAsiaTheme="minorHAnsi" w:hAnsiTheme="minorHAnsi"/>
+        <w:rFonts w:asciiTheme="minorHAnsi" w:cstheme="minorBidi" w:eastAsiaTheme="minorEastAsia" w:hAnsiTheme="minorHAnsi"/>
         <w:sz w:val="24"/>
         <w:szCs w:val="24"/>
-        <w:lang w:bidi="ar-SA" w:eastAsia="en-US" w:val="en-US"/>
+        <w:lang w:bidi="ar-SA" w:eastAsia="zh-CN" w:val="en-US"/>
       </w:rPr>
     </w:rPrDefault>
     <w:pPrDefault>
@@ -3469,10 +3219,10 @@
     <w:name w:val="Body Text"/>
     <w:basedOn w:val="Normal"/>
     <w:link w:val="BodyTextChar"/>
+    <w:qFormat/>
     <w:pPr>
       <w:spacing w:after="180" w:before="180"/>
     </w:pPr>
-    <w:qFormat/>
   </w:style>
   <w:style w:customStyle="1" w:styleId="FirstParagraph" w:type="paragraph">
     <w:name w:val="First Paragraph"/>
@@ -3492,57 +3242,94 @@
     <w:name w:val="Title"/>
     <w:basedOn w:val="Normal"/>
     <w:next w:val="BodyText"/>
+    <w:link w:val="TitleChar"/>
+    <w:uiPriority w:val="10"/>
     <w:qFormat/>
+    <w:rsid w:val="00A10FD9"/>
     <w:pPr>
-      <w:keepNext/>
-      <w:keepLines/>
-      <w:spacing w:after="240" w:before="480"/>
+      <w:spacing w:after="80" w:line="240" w:lineRule="auto"/>
+      <w:contextualSpacing/>
       <w:jc w:val="center"/>
     </w:pPr>
     <w:rPr>
       <w:rFonts w:asciiTheme="majorHAnsi" w:cstheme="majorBidi" w:eastAsiaTheme="majorEastAsia" w:hAnsiTheme="majorHAnsi"/>
-      <w:b/>
-      <w:bCs/>
-      <w:color w:themeColor="accent1" w:themeShade="B5" w:val="345A8A"/>
-      <w:sz w:val="36"/>
-      <w:szCs w:val="36"/>
+      <w:sz w:val="56"/>
+      <w:szCs w:val="56"/>
+    </w:rPr>
+  </w:style>
+  <w:style w:customStyle="1" w:styleId="TitleChar" w:type="character">
+    <w:name w:val="Title Char"/>
+    <w:basedOn w:val="DefaultParagraphFont"/>
+    <w:link w:val="Title"/>
+    <w:uiPriority w:val="10"/>
+    <w:rsid w:val="00A10FD9"/>
+    <w:rPr>
+      <w:rFonts w:asciiTheme="majorHAnsi" w:cstheme="majorBidi" w:eastAsiaTheme="majorEastAsia" w:hAnsiTheme="majorHAnsi"/>
+      <w:sz w:val="56"/>
+      <w:szCs w:val="56"/>
     </w:rPr>
   </w:style>
   <w:style w:styleId="Subtitle" w:type="paragraph">
     <w:name w:val="Subtitle"/>
+    <w:basedOn w:val="Title"/>
+    <w:next w:val="BodyText"/>
+    <w:link w:val="SubtitleChar"/>
+    <w:uiPriority w:val="11"/>
+    <w:qFormat/>
+    <w:rsid w:val="00A10FD9"/>
+    <w:pPr>
+      <w:numPr>
+        <w:ilvl w:val="1"/>
+      </w:numPr>
+    </w:pPr>
+    <w:rPr>
+      <w:rFonts w:cstheme="majorBidi" w:eastAsiaTheme="majorEastAsia"/>
+      <w:spacing w:val="15"/>
+      <w:sz w:val="28"/>
+      <w:szCs w:val="28"/>
+    </w:rPr>
+  </w:style>
+  <w:style w:customStyle="1" w:styleId="SubtitleChar" w:type="character">
+    <w:name w:val="Subtitle Char"/>
+    <w:basedOn w:val="DefaultParagraphFont"/>
+    <w:link w:val="Subtitle"/>
+    <w:uiPriority w:val="11"/>
+    <w:rsid w:val="00A10FD9"/>
+    <w:rPr>
+      <w:rFonts w:cstheme="majorBidi" w:eastAsiaTheme="majorEastAsia"/>
+      <w:color w:themeColor="text1" w:themeTint="A6" w:val="595959"/>
+      <w:spacing w:val="15"/>
+      <w:sz w:val="28"/>
+      <w:szCs w:val="28"/>
+    </w:rPr>
+  </w:style>
+  <w:style w:customStyle="1" w:styleId="Author" w:type="paragraph">
+    <w:name w:val="Author"/>
     <w:basedOn w:val="Title"/>
     <w:next w:val="BodyText"/>
     <w:qFormat/>
     <w:pPr>
       <w:keepNext/>
       <w:keepLines/>
-      <w:spacing w:after="240" w:before="240"/>
-      <w:jc w:val="center"/>
     </w:pPr>
     <w:rPr>
-      <w:sz w:val="30"/>
-      <w:szCs w:val="30"/>
-    </w:rPr>
-  </w:style>
-  <w:style w:customStyle="1" w:styleId="Author" w:type="paragraph">
-    <w:name w:val="Author"/>
+      <w:sz w:val="24"/>
+      <w:szCs w:val="24"/>
+    </w:rPr>
+  </w:style>
+  <w:style w:styleId="Date" w:type="paragraph">
+    <w:name w:val="Date"/>
+    <w:basedOn w:val="Title"/>
     <w:next w:val="BodyText"/>
     <w:qFormat/>
     <w:pPr>
       <w:keepNext/>
       <w:keepLines/>
-      <w:jc w:val="center"/>
     </w:pPr>
-  </w:style>
-  <w:style w:styleId="Date" w:type="paragraph">
-    <w:name w:val="Date"/>
-    <w:next w:val="BodyText"/>
-    <w:qFormat/>
-    <w:pPr>
-      <w:keepNext/>
-      <w:keepLines/>
-      <w:jc w:val="center"/>
-    </w:pPr>
+    <w:rPr>
+      <w:sz w:val="24"/>
+      <w:szCs w:val="24"/>
+    </w:rPr>
   </w:style>
   <w:style w:customStyle="1" w:styleId="AbstractTitle" w:type="paragraph">
     <w:name w:val="Abstract Title"/>
@@ -3552,15 +3339,13 @@
     <w:pPr>
       <w:keepNext/>
       <w:keepLines/>
+      <w:spacing w:after="0" w:before="300"/>
       <w:jc w:val="center"/>
-      <w:spacing w:after="0" w:before="300"/>
     </w:pPr>
     <w:rPr>
+      <w:b/>
       <w:sz w:val="20"/>
       <w:szCs w:val="20"/>
-      <w:b/>
-      <w:color w:val="345A8A"/>
-      &gt;
     </w:rPr>
   </w:style>
   <w:style w:customStyle="1" w:styleId="Abstract" w:type="paragraph">
@@ -3587,191 +3372,321 @@
     <w:rPr/>
   </w:style>
   <w:style w:styleId="Heading1" w:type="paragraph">
-    <w:name w:val="Heading 1"/>
+    <w:name w:val="heading 1"/>
     <w:basedOn w:val="Normal"/>
     <w:next w:val="BodyText"/>
+    <w:link w:val="Heading1Char"/>
     <w:uiPriority w:val="9"/>
     <w:qFormat/>
+    <w:rsid w:val="00A10FD9"/>
     <w:pPr>
       <w:keepNext/>
       <w:keepLines/>
-      <w:spacing w:after="0" w:before="480"/>
+      <w:spacing w:after="80" w:before="360"/>
       <w:outlineLvl w:val="0"/>
     </w:pPr>
     <w:rPr>
       <w:rFonts w:asciiTheme="majorHAnsi" w:cstheme="majorBidi" w:eastAsiaTheme="majorEastAsia" w:hAnsiTheme="majorHAnsi"/>
-      <w:b/>
-      <w:bCs/>
-      <w:color w:themeColor="accent1" w:val="4F81BD"/>
-      <w:sz w:val="32"/>
-      <w:szCs w:val="32"/>
+      <w:color w:themeColor="accent1" w:themeShade="BF" w:val="0F4761"/>
+      <w:sz w:val="40"/>
+      <w:szCs w:val="40"/>
     </w:rPr>
   </w:style>
   <w:style w:styleId="Heading2" w:type="paragraph">
-    <w:name w:val="Heading 2"/>
+    <w:name w:val="heading 2"/>
     <w:basedOn w:val="Normal"/>
     <w:next w:val="BodyText"/>
+    <w:link w:val="Heading2Char"/>
     <w:uiPriority w:val="9"/>
+    <w:semiHidden/>
     <w:unhideWhenUsed/>
     <w:qFormat/>
+    <w:rsid w:val="00A10FD9"/>
     <w:pPr>
       <w:keepNext/>
       <w:keepLines/>
-      <w:spacing w:after="0" w:before="200"/>
+      <w:spacing w:after="80" w:before="160"/>
       <w:outlineLvl w:val="1"/>
     </w:pPr>
     <w:rPr>
       <w:rFonts w:asciiTheme="majorHAnsi" w:cstheme="majorBidi" w:eastAsiaTheme="majorEastAsia" w:hAnsiTheme="majorHAnsi"/>
-      <w:b/>
-      <w:bCs/>
-      <w:color w:themeColor="accent1" w:val="4F81BD"/>
-      <w:sz w:val="28"/>
-      <w:szCs w:val="28"/>
+      <w:color w:themeColor="accent1" w:themeShade="BF" w:val="0F4761"/>
+      <w:sz w:val="32"/>
+      <w:szCs w:val="32"/>
     </w:rPr>
   </w:style>
   <w:style w:styleId="Heading3" w:type="paragraph">
-    <w:name w:val="Heading 3"/>
+    <w:name w:val="heading 3"/>
     <w:basedOn w:val="Normal"/>
     <w:next w:val="BodyText"/>
+    <w:link w:val="Heading3Char"/>
     <w:uiPriority w:val="9"/>
+    <w:semiHidden/>
     <w:unhideWhenUsed/>
     <w:qFormat/>
+    <w:rsid w:val="00A10FD9"/>
     <w:pPr>
       <w:keepNext/>
       <w:keepLines/>
-      <w:spacing w:after="0" w:before="200"/>
+      <w:spacing w:after="80" w:before="160"/>
       <w:outlineLvl w:val="2"/>
     </w:pPr>
     <w:rPr>
-      <w:rFonts w:asciiTheme="majorHAnsi" w:cstheme="majorBidi" w:eastAsiaTheme="majorEastAsia" w:hAnsiTheme="majorHAnsi"/>
-      <w:b/>
-      <w:bCs/>
-      <w:color w:themeColor="accent1" w:val="4F81BD"/>
-      <w:sz w:val="24"/>
-      <w:szCs w:val="24"/>
+      <w:rFonts w:cstheme="majorBidi" w:eastAsiaTheme="majorEastAsia"/>
+      <w:color w:themeColor="accent1" w:themeShade="BF" w:val="0F4761"/>
+      <w:sz w:val="28"/>
+      <w:szCs w:val="28"/>
     </w:rPr>
   </w:style>
   <w:style w:styleId="Heading4" w:type="paragraph">
-    <w:name w:val="Heading 4"/>
+    <w:name w:val="heading 4"/>
     <w:basedOn w:val="Normal"/>
     <w:next w:val="BodyText"/>
+    <w:link w:val="Heading4Char"/>
     <w:uiPriority w:val="9"/>
+    <w:semiHidden/>
     <w:unhideWhenUsed/>
     <w:qFormat/>
+    <w:rsid w:val="00A10FD9"/>
     <w:pPr>
       <w:keepNext/>
       <w:keepLines/>
-      <w:spacing w:after="0" w:before="200"/>
+      <w:spacing w:after="40" w:before="80"/>
       <w:outlineLvl w:val="3"/>
     </w:pPr>
     <w:rPr>
-      <w:rFonts w:asciiTheme="majorHAnsi" w:cstheme="majorBidi" w:eastAsiaTheme="majorEastAsia" w:hAnsiTheme="majorHAnsi"/>
+      <w:rFonts w:cstheme="majorBidi" w:eastAsiaTheme="majorEastAsia"/>
       <w:i/>
-      <w:bCs/>
-      <w:color w:themeColor="accent1" w:val="4F81BD"/>
-      <w:sz w:val="24"/>
-      <w:szCs w:val="24"/>
+      <w:iCs/>
+      <w:color w:themeColor="accent1" w:themeShade="BF" w:val="0F4761"/>
     </w:rPr>
   </w:style>
   <w:style w:styleId="Heading5" w:type="paragraph">
-    <w:name w:val="Heading 5"/>
+    <w:name w:val="heading 5"/>
     <w:basedOn w:val="Normal"/>
     <w:next w:val="BodyText"/>
+    <w:link w:val="Heading5Char"/>
     <w:uiPriority w:val="9"/>
+    <w:semiHidden/>
     <w:unhideWhenUsed/>
     <w:qFormat/>
+    <w:rsid w:val="00A10FD9"/>
     <w:pPr>
       <w:keepNext/>
       <w:keepLines/>
-      <w:spacing w:after="0" w:before="200"/>
+      <w:spacing w:after="40" w:before="80"/>
       <w:outlineLvl w:val="4"/>
     </w:pPr>
     <w:rPr>
-      <w:rFonts w:asciiTheme="majorHAnsi" w:cstheme="majorBidi" w:eastAsiaTheme="majorEastAsia" w:hAnsiTheme="majorHAnsi"/>
-      <w:iCs/>
-      <w:color w:themeColor="accent1" w:val="4F81BD"/>
-      <w:sz w:val="24"/>
-      <w:szCs w:val="24"/>
+      <w:rFonts w:cstheme="majorBidi" w:eastAsiaTheme="majorEastAsia"/>
+      <w:color w:themeColor="accent1" w:themeShade="BF" w:val="0F4761"/>
     </w:rPr>
   </w:style>
   <w:style w:styleId="Heading6" w:type="paragraph">
-    <w:name w:val="Heading 6"/>
+    <w:name w:val="heading 6"/>
     <w:basedOn w:val="Normal"/>
     <w:next w:val="BodyText"/>
+    <w:link w:val="Heading6Char"/>
     <w:uiPriority w:val="9"/>
+    <w:semiHidden/>
     <w:unhideWhenUsed/>
     <w:qFormat/>
+    <w:rsid w:val="00A10FD9"/>
     <w:pPr>
       <w:keepNext/>
       <w:keepLines/>
-      <w:spacing w:after="0" w:before="200"/>
+      <w:spacing w:after="0" w:before="40"/>
       <w:outlineLvl w:val="5"/>
     </w:pPr>
     <w:rPr>
-      <w:rFonts w:asciiTheme="majorHAnsi" w:cstheme="majorBidi" w:eastAsiaTheme="majorEastAsia" w:hAnsiTheme="majorHAnsi"/>
-      <w:color w:themeColor="accent1" w:val="4F81BD"/>
-      <w:sz w:val="24"/>
-      <w:szCs w:val="24"/>
+      <w:rFonts w:cstheme="majorBidi" w:eastAsiaTheme="majorEastAsia"/>
+      <w:i/>
+      <w:iCs/>
+      <w:color w:themeColor="text1" w:themeTint="A6" w:val="595959"/>
     </w:rPr>
   </w:style>
   <w:style w:styleId="Heading7" w:type="paragraph">
-    <w:name w:val="Heading 7"/>
+    <w:name w:val="heading 7"/>
     <w:basedOn w:val="Normal"/>
     <w:next w:val="BodyText"/>
+    <w:link w:val="Heading7Char"/>
     <w:uiPriority w:val="9"/>
+    <w:semiHidden/>
     <w:unhideWhenUsed/>
     <w:qFormat/>
+    <w:rsid w:val="00A10FD9"/>
     <w:pPr>
       <w:keepNext/>
       <w:keepLines/>
-      <w:spacing w:after="0" w:before="200"/>
+      <w:spacing w:after="0" w:before="40"/>
       <w:outlineLvl w:val="6"/>
     </w:pPr>
     <w:rPr>
-      <w:rFonts w:asciiTheme="majorHAnsi" w:cstheme="majorBidi" w:eastAsiaTheme="majorEastAsia" w:hAnsiTheme="majorHAnsi"/>
-      <w:color w:themeColor="accent1" w:val="4F81BD"/>
-      <w:sz w:val="24"/>
-      <w:szCs w:val="24"/>
+      <w:rFonts w:cstheme="majorBidi" w:eastAsiaTheme="majorEastAsia"/>
+      <w:color w:themeColor="text1" w:themeTint="A6" w:val="595959"/>
     </w:rPr>
   </w:style>
   <w:style w:styleId="Heading8" w:type="paragraph">
-    <w:name w:val="Heading 8"/>
+    <w:name w:val="heading 8"/>
     <w:basedOn w:val="Normal"/>
     <w:next w:val="BodyText"/>
+    <w:link w:val="Heading8Char"/>
     <w:uiPriority w:val="9"/>
+    <w:semiHidden/>
     <w:unhideWhenUsed/>
     <w:qFormat/>
+    <w:rsid w:val="00A10FD9"/>
     <w:pPr>
       <w:keepNext/>
       <w:keepLines/>
-      <w:spacing w:after="0" w:before="200"/>
+      <w:spacing w:after="0"/>
       <w:outlineLvl w:val="7"/>
     </w:pPr>
     <w:rPr>
-      <w:rFonts w:asciiTheme="majorHAnsi" w:cstheme="majorBidi" w:eastAsiaTheme="majorEastAsia" w:hAnsiTheme="majorHAnsi"/>
-      <w:color w:themeColor="accent1" w:val="4F81BD"/>
-      <w:sz w:val="24"/>
-      <w:szCs w:val="24"/>
+      <w:rFonts w:cstheme="majorBidi" w:eastAsiaTheme="majorEastAsia"/>
+      <w:i/>
+      <w:iCs/>
+      <w:color w:themeColor="text1" w:themeTint="D8" w:val="272727"/>
     </w:rPr>
   </w:style>
   <w:style w:styleId="Heading9" w:type="paragraph">
-    <w:name w:val="Heading 9"/>
+    <w:name w:val="heading 9"/>
     <w:basedOn w:val="Normal"/>
     <w:next w:val="BodyText"/>
+    <w:link w:val="Heading9Char"/>
     <w:uiPriority w:val="9"/>
+    <w:semiHidden/>
     <w:unhideWhenUsed/>
     <w:qFormat/>
+    <w:rsid w:val="00A10FD9"/>
     <w:pPr>
       <w:keepNext/>
       <w:keepLines/>
-      <w:spacing w:after="0" w:before="200"/>
+      <w:spacing w:after="0"/>
       <w:outlineLvl w:val="8"/>
     </w:pPr>
     <w:rPr>
+      <w:rFonts w:cstheme="majorBidi" w:eastAsiaTheme="majorEastAsia"/>
+      <w:color w:themeColor="text1" w:themeTint="D8" w:val="272727"/>
+    </w:rPr>
+  </w:style>
+  <w:style w:customStyle="1" w:styleId="Heading1Char" w:type="character">
+    <w:name w:val="Heading 1 Char"/>
+    <w:basedOn w:val="DefaultParagraphFont"/>
+    <w:link w:val="Heading1"/>
+    <w:uiPriority w:val="9"/>
+    <w:rsid w:val="00A10FD9"/>
+    <w:rPr>
       <w:rFonts w:asciiTheme="majorHAnsi" w:cstheme="majorBidi" w:eastAsiaTheme="majorEastAsia" w:hAnsiTheme="majorHAnsi"/>
-      <w:color w:themeColor="accent1" w:val="4F81BD"/>
-      <w:sz w:val="24"/>
-      <w:szCs w:val="24"/>
+      <w:color w:themeColor="accent1" w:themeShade="BF" w:val="0F4761"/>
+      <w:sz w:val="40"/>
+      <w:szCs w:val="40"/>
+    </w:rPr>
+  </w:style>
+  <w:style w:customStyle="1" w:styleId="Heading2Char" w:type="character">
+    <w:name w:val="Heading 2 Char"/>
+    <w:basedOn w:val="DefaultParagraphFont"/>
+    <w:link w:val="Heading2"/>
+    <w:uiPriority w:val="9"/>
+    <w:semiHidden/>
+    <w:rsid w:val="00A10FD9"/>
+    <w:rPr>
+      <w:rFonts w:asciiTheme="majorHAnsi" w:cstheme="majorBidi" w:eastAsiaTheme="majorEastAsia" w:hAnsiTheme="majorHAnsi"/>
+      <w:color w:themeColor="accent1" w:themeShade="BF" w:val="0F4761"/>
+      <w:sz w:val="32"/>
+      <w:szCs w:val="32"/>
+    </w:rPr>
+  </w:style>
+  <w:style w:customStyle="1" w:styleId="Heading3Char" w:type="character">
+    <w:name w:val="Heading 3 Char"/>
+    <w:basedOn w:val="DefaultParagraphFont"/>
+    <w:link w:val="Heading3"/>
+    <w:uiPriority w:val="9"/>
+    <w:semiHidden/>
+    <w:rsid w:val="00A10FD9"/>
+    <w:rPr>
+      <w:rFonts w:cstheme="majorBidi" w:eastAsiaTheme="majorEastAsia"/>
+      <w:color w:themeColor="accent1" w:themeShade="BF" w:val="0F4761"/>
+      <w:sz w:val="28"/>
+      <w:szCs w:val="28"/>
+    </w:rPr>
+  </w:style>
+  <w:style w:customStyle="1" w:styleId="Heading4Char" w:type="character">
+    <w:name w:val="Heading 4 Char"/>
+    <w:basedOn w:val="DefaultParagraphFont"/>
+    <w:link w:val="Heading4"/>
+    <w:uiPriority w:val="9"/>
+    <w:semiHidden/>
+    <w:rsid w:val="00A10FD9"/>
+    <w:rPr>
+      <w:rFonts w:cstheme="majorBidi" w:eastAsiaTheme="majorEastAsia"/>
+      <w:i/>
+      <w:iCs/>
+      <w:color w:themeColor="accent1" w:themeShade="BF" w:val="0F4761"/>
+    </w:rPr>
+  </w:style>
+  <w:style w:customStyle="1" w:styleId="Heading5Char" w:type="character">
+    <w:name w:val="Heading 5 Char"/>
+    <w:basedOn w:val="DefaultParagraphFont"/>
+    <w:link w:val="Heading5"/>
+    <w:uiPriority w:val="9"/>
+    <w:semiHidden/>
+    <w:rsid w:val="00A10FD9"/>
+    <w:rPr>
+      <w:rFonts w:cstheme="majorBidi" w:eastAsiaTheme="majorEastAsia"/>
+      <w:color w:themeColor="accent1" w:themeShade="BF" w:val="0F4761"/>
+    </w:rPr>
+  </w:style>
+  <w:style w:customStyle="1" w:styleId="Heading6Char" w:type="character">
+    <w:name w:val="Heading 6 Char"/>
+    <w:basedOn w:val="DefaultParagraphFont"/>
+    <w:link w:val="Heading6"/>
+    <w:uiPriority w:val="9"/>
+    <w:semiHidden/>
+    <w:rsid w:val="00A10FD9"/>
+    <w:rPr>
+      <w:rFonts w:cstheme="majorBidi" w:eastAsiaTheme="majorEastAsia"/>
+      <w:i/>
+      <w:iCs/>
+      <w:color w:themeColor="text1" w:themeTint="A6" w:val="595959"/>
+    </w:rPr>
+  </w:style>
+  <w:style w:customStyle="1" w:styleId="Heading7Char" w:type="character">
+    <w:name w:val="Heading 7 Char"/>
+    <w:basedOn w:val="DefaultParagraphFont"/>
+    <w:link w:val="Heading7"/>
+    <w:uiPriority w:val="9"/>
+    <w:semiHidden/>
+    <w:rsid w:val="00A10FD9"/>
+    <w:rPr>
+      <w:rFonts w:cstheme="majorBidi" w:eastAsiaTheme="majorEastAsia"/>
+      <w:color w:themeColor="text1" w:themeTint="A6" w:val="595959"/>
+    </w:rPr>
+  </w:style>
+  <w:style w:customStyle="1" w:styleId="Heading8Char" w:type="character">
+    <w:name w:val="Heading 8 Char"/>
+    <w:basedOn w:val="DefaultParagraphFont"/>
+    <w:link w:val="Heading8"/>
+    <w:uiPriority w:val="9"/>
+    <w:semiHidden/>
+    <w:rsid w:val="00A10FD9"/>
+    <w:rPr>
+      <w:rFonts w:cstheme="majorBidi" w:eastAsiaTheme="majorEastAsia"/>
+      <w:i/>
+      <w:iCs/>
+      <w:color w:themeColor="text1" w:themeTint="D8" w:val="272727"/>
+    </w:rPr>
+  </w:style>
+  <w:style w:customStyle="1" w:styleId="Heading9Char" w:type="character">
+    <w:name w:val="Heading 9 Char"/>
+    <w:basedOn w:val="DefaultParagraphFont"/>
+    <w:link w:val="Heading9"/>
+    <w:uiPriority w:val="9"/>
+    <w:semiHidden/>
+    <w:rsid w:val="00A10FD9"/>
+    <w:rPr>
+      <w:rFonts w:cstheme="majorBidi" w:eastAsiaTheme="majorEastAsia"/>
+      <w:color w:themeColor="text1" w:themeTint="D8" w:val="272727"/>
     </w:rPr>
   </w:style>
   <w:style w:styleId="BlockText" w:type="paragraph">
@@ -3793,6 +3708,18 @@
     <w:uiPriority w:val="9"/>
     <w:unhideWhenUsed/>
     <w:qFormat/>
+  </w:style>
+  <w:style w:styleId="FootnoteBlockText" w:type="paragraph">
+    <w:name w:val="Footnote Block Text"/>
+    <w:basedOn w:val="FootnoteText"/>
+    <w:next w:val="FootnoteText"/>
+    <w:uiPriority w:val="9"/>
+    <w:unhideWhenUsed/>
+    <w:qFormat/>
+    <w:pPr>
+      <w:spacing w:after="100" w:before="100"/>
+      <w:ind w:firstLine="0" w:left="480" w:right="480"/>
+    </w:pPr>
   </w:style>
   <w:style w:default="1" w:styleId="DefaultParagraphFont" w:type="character">
     <w:name w:val="Default Paragraph Font"/>
@@ -3815,18 +3742,11 @@
       </w:tblCellMar>
     </w:tblPr>
     <w:tblStylePr w:type="firstRow">
-      <w:tblPr>
-        <w:jc w:val="left"/>
-        <w:tblInd w:type="dxa" w:w="0"/>
-      </w:tblPr>
-      <w:trPr>
-        <w:jc w:val="left"/>
-      </w:trPr>
       <w:tcPr>
-        <w:vAlign w:val="bottom"/>
         <w:tcBorders>
           <w:bottom w:val="single"/>
         </w:tcBorders>
+        <w:vAlign w:val="bottom"/>
       </w:tcPr>
     </w:tblStylePr>
   </w:style>
@@ -3941,8 +3861,8 @@
     <w:name w:val="KeywordTok"/>
     <w:basedOn w:val="VerbatimChar"/>
     <w:rPr>
+      <w:b/>
       <w:color w:val="007020"/>
-      <w:b/>
     </w:rPr>
   </w:style>
   <w:style w:type="character" w:customStyle="1" w:styleId="DataTypeTok">
@@ -4019,42 +3939,42 @@
     <w:name w:val="ImportTok"/>
     <w:basedOn w:val="VerbatimChar"/>
     <w:rPr>
+      <w:b/>
       <w:color w:val="008000"/>
-      <w:b/>
     </w:rPr>
   </w:style>
   <w:style w:type="character" w:customStyle="1" w:styleId="CommentTok">
     <w:name w:val="CommentTok"/>
     <w:basedOn w:val="VerbatimChar"/>
     <w:rPr>
+      <w:i/>
       <w:color w:val="60a0b0"/>
-      <w:i/>
     </w:rPr>
   </w:style>
   <w:style w:type="character" w:customStyle="1" w:styleId="DocumentationTok">
     <w:name w:val="DocumentationTok"/>
     <w:basedOn w:val="VerbatimChar"/>
     <w:rPr>
+      <w:i/>
       <w:color w:val="ba2121"/>
-      <w:i/>
     </w:rPr>
   </w:style>
   <w:style w:type="character" w:customStyle="1" w:styleId="AnnotationTok">
     <w:name w:val="AnnotationTok"/>
     <w:basedOn w:val="VerbatimChar"/>
     <w:rPr>
-      <w:color w:val="60a0b0"/>
       <w:b/>
       <w:i/>
+      <w:color w:val="60a0b0"/>
     </w:rPr>
   </w:style>
   <w:style w:type="character" w:customStyle="1" w:styleId="CommentVarTok">
     <w:name w:val="CommentVarTok"/>
     <w:basedOn w:val="VerbatimChar"/>
     <w:rPr>
-      <w:color w:val="60a0b0"/>
       <w:b/>
       <w:i/>
+      <w:color w:val="60a0b0"/>
     </w:rPr>
   </w:style>
   <w:style w:type="character" w:customStyle="1" w:styleId="OtherTok">
@@ -4082,8 +4002,8 @@
     <w:name w:val="ControlFlowTok"/>
     <w:basedOn w:val="VerbatimChar"/>
     <w:rPr>
+      <w:b/>
       <w:color w:val="007020"/>
-      <w:b/>
     </w:rPr>
   </w:style>
   <w:style w:type="character" w:customStyle="1" w:styleId="OperatorTok">
@@ -4128,34 +4048,34 @@
     <w:name w:val="InformationTok"/>
     <w:basedOn w:val="VerbatimChar"/>
     <w:rPr>
-      <w:color w:val="60a0b0"/>
       <w:b/>
       <w:i/>
+      <w:color w:val="60a0b0"/>
     </w:rPr>
   </w:style>
   <w:style w:type="character" w:customStyle="1" w:styleId="WarningTok">
     <w:name w:val="WarningTok"/>
     <w:basedOn w:val="VerbatimChar"/>
     <w:rPr>
-      <w:color w:val="60a0b0"/>
       <w:b/>
       <w:i/>
+      <w:color w:val="60a0b0"/>
     </w:rPr>
   </w:style>
   <w:style w:type="character" w:customStyle="1" w:styleId="AlertTok">
     <w:name w:val="AlertTok"/>
     <w:basedOn w:val="VerbatimChar"/>
     <w:rPr>
+      <w:b/>
       <w:color w:val="ff0000"/>
-      <w:b/>
     </w:rPr>
   </w:style>
   <w:style w:type="character" w:customStyle="1" w:styleId="ErrorTok">
     <w:name w:val="ErrorTok"/>
     <w:basedOn w:val="VerbatimChar"/>
     <w:rPr>
+      <w:b/>
       <w:color w:val="ff0000"/>
-      <w:b/>
     </w:rPr>
   </w:style>
   <w:style w:type="character" w:customStyle="1" w:styleId="NormalTok">
@@ -4177,44 +4097,44 @@
         <a:sysClr val="window" lastClr="FFFFFF"/>
       </a:lt1>
       <a:dk2>
-        <a:srgbClr val="1F497D"/>
+        <a:srgbClr val="0E2841"/>
       </a:dk2>
       <a:lt2>
-        <a:srgbClr val="EEECE1"/>
+        <a:srgbClr val="E8E8E8"/>
       </a:lt2>
       <a:accent1>
-        <a:srgbClr val="4F81BD"/>
+        <a:srgbClr val="156082"/>
       </a:accent1>
       <a:accent2>
-        <a:srgbClr val="C0504D"/>
+        <a:srgbClr val="E97132"/>
       </a:accent2>
       <a:accent3>
-        <a:srgbClr val="9BBB59"/>
+        <a:srgbClr val="196B24"/>
       </a:accent3>
       <a:accent4>
-        <a:srgbClr val="8064A2"/>
+        <a:srgbClr val="0F9ED5"/>
       </a:accent4>
       <a:accent5>
-        <a:srgbClr val="4BACC6"/>
+        <a:srgbClr val="A02B93"/>
       </a:accent5>
       <a:accent6>
-        <a:srgbClr val="F79646"/>
+        <a:srgbClr val="4EA72E"/>
       </a:accent6>
       <a:hlink>
-        <a:srgbClr val="0000FF"/>
+        <a:srgbClr val="467886"/>
       </a:hlink>
       <a:folHlink>
-        <a:srgbClr val="800080"/>
+        <a:srgbClr val="96607D"/>
       </a:folHlink>
     </a:clrScheme>
     <a:fontScheme name="Office">
       <a:majorFont>
-        <a:latin typeface="Calibri"/>
+        <a:latin typeface="Aptos Display" panose="02110004020202020204"/>
         <a:ea typeface=""/>
         <a:cs typeface=""/>
-        <a:font script="Jpan" typeface="ＭＳ ゴシック"/>
+        <a:font script="Jpan" typeface="游ゴシック Light"/>
         <a:font script="Hang" typeface="맑은 고딕"/>
-        <a:font script="Hans" typeface="宋体"/>
+        <a:font script="Hans" typeface="等线 Light"/>
         <a:font script="Hant" typeface="新細明體"/>
         <a:font script="Arab" typeface="Times New Roman"/>
         <a:font script="Hebr" typeface="Times New Roman"/>
@@ -4241,14 +4161,32 @@
         <a:font script="Mong" typeface="Mongolian Baiti"/>
         <a:font script="Viet" typeface="Times New Roman"/>
         <a:font script="Uigh" typeface="Microsoft Uighur"/>
+        <a:font script="Geor" typeface="Sylfaen"/>
+        <a:font script="Armn" typeface="Arial"/>
+        <a:font script="Bugi" typeface="Leelawadee UI"/>
+        <a:font script="Bopo" typeface="Microsoft JhengHei"/>
+        <a:font script="Java" typeface="Javanese Text"/>
+        <a:font script="Lisu" typeface="Segoe UI"/>
+        <a:font script="Mymr" typeface="Myanmar Text"/>
+        <a:font script="Nkoo" typeface="Ebrima"/>
+        <a:font script="Olck" typeface="Nirmala UI"/>
+        <a:font script="Osma" typeface="Ebrima"/>
+        <a:font script="Phag" typeface="Phagspa"/>
+        <a:font script="Syrn" typeface="Estrangelo Edessa"/>
+        <a:font script="Syrj" typeface="Estrangelo Edessa"/>
+        <a:font script="Syre" typeface="Estrangelo Edessa"/>
+        <a:font script="Sora" typeface="Nirmala UI"/>
+        <a:font script="Tale" typeface="Microsoft Tai Le"/>
+        <a:font script="Talu" typeface="Microsoft New Tai Lue"/>
+        <a:font script="Tfng" typeface="Ebrima"/>
       </a:majorFont>
       <a:minorFont>
-        <a:latin typeface="Cambria"/>
+        <a:latin typeface="Aptos" panose="02110004020202020204"/>
         <a:ea typeface=""/>
         <a:cs typeface=""/>
-        <a:font script="Jpan" typeface="ＭＳ 明朝"/>
+        <a:font script="Jpan" typeface="游明朝"/>
         <a:font script="Hang" typeface="맑은 고딕"/>
-        <a:font script="Hans" typeface="宋体"/>
+        <a:font script="Hans" typeface="等线"/>
         <a:font script="Hant" typeface="新細明體"/>
         <a:font script="Arab" typeface="Arial"/>
         <a:font script="Hebr" typeface="Arial"/>
@@ -4275,6 +4213,24 @@
         <a:font script="Mong" typeface="Mongolian Baiti"/>
         <a:font script="Viet" typeface="Arial"/>
         <a:font script="Uigh" typeface="Microsoft Uighur"/>
+        <a:font script="Geor" typeface="Sylfaen"/>
+        <a:font script="Armn" typeface="Arial"/>
+        <a:font script="Bugi" typeface="Leelawadee UI"/>
+        <a:font script="Bopo" typeface="Microsoft JhengHei"/>
+        <a:font script="Java" typeface="Javanese Text"/>
+        <a:font script="Lisu" typeface="Segoe UI"/>
+        <a:font script="Mymr" typeface="Myanmar Text"/>
+        <a:font script="Nkoo" typeface="Ebrima"/>
+        <a:font script="Olck" typeface="Nirmala UI"/>
+        <a:font script="Osma" typeface="Ebrima"/>
+        <a:font script="Phag" typeface="Phagspa"/>
+        <a:font script="Syrn" typeface="Estrangelo Edessa"/>
+        <a:font script="Syrj" typeface="Estrangelo Edessa"/>
+        <a:font script="Syre" typeface="Estrangelo Edessa"/>
+        <a:font script="Sora" typeface="Nirmala UI"/>
+        <a:font script="Tale" typeface="Microsoft Tai Le"/>
+        <a:font script="Talu" typeface="Microsoft New Tai Lue"/>
+        <a:font script="Tfng" typeface="Ebrima"/>
       </a:minorFont>
     </a:fontScheme>
     <a:fmtScheme name="Office">
@@ -4286,200 +4242,141 @@
           <a:gsLst>
             <a:gs pos="0">
               <a:schemeClr val="phClr">
-                <a:tint val="50000"/>
-                <a:satMod val="300000"/>
+                <a:lumMod val="110000"/>
+                <a:satMod val="105000"/>
+                <a:tint val="67000"/>
               </a:schemeClr>
             </a:gs>
-            <a:gs pos="35000">
+            <a:gs pos="50000">
               <a:schemeClr val="phClr">
-                <a:tint val="37000"/>
-                <a:satMod val="300000"/>
+                <a:lumMod val="105000"/>
+                <a:satMod val="103000"/>
+                <a:tint val="73000"/>
               </a:schemeClr>
             </a:gs>
             <a:gs pos="100000">
               <a:schemeClr val="phClr">
-                <a:tint val="15000"/>
-                <a:satMod val="350000"/>
+                <a:lumMod val="105000"/>
+                <a:satMod val="109000"/>
+                <a:tint val="81000"/>
               </a:schemeClr>
             </a:gs>
           </a:gsLst>
-          <a:lin ang="16200000" scaled="1"/>
+          <a:lin ang="5400000" scaled="0"/>
         </a:gradFill>
         <a:gradFill rotWithShape="1">
           <a:gsLst>
             <a:gs pos="0">
               <a:schemeClr val="phClr">
-                <a:tint val="100000"/>
+                <a:satMod val="103000"/>
+                <a:lumMod val="102000"/>
+                <a:tint val="94000"/>
+              </a:schemeClr>
+            </a:gs>
+            <a:gs pos="50000">
+              <a:schemeClr val="phClr">
+                <a:satMod val="110000"/>
+                <a:lumMod val="100000"/>
                 <a:shade val="100000"/>
-                <a:satMod val="130000"/>
               </a:schemeClr>
             </a:gs>
             <a:gs pos="100000">
               <a:schemeClr val="phClr">
-                <a:tint val="50000"/>
-                <a:shade val="100000"/>
-                <a:satMod val="350000"/>
+                <a:lumMod val="99000"/>
+                <a:satMod val="120000"/>
+                <a:shade val="78000"/>
               </a:schemeClr>
             </a:gs>
           </a:gsLst>
-          <a:lin ang="16200000" scaled="0"/>
+          <a:lin ang="5400000" scaled="0"/>
         </a:gradFill>
       </a:fillStyleLst>
       <a:lnStyleLst>
-        <a:ln w="9525" cap="flat" cmpd="sng" algn="ctr">
-          <a:solidFill>
-            <a:schemeClr val="phClr">
-              <a:shade val="95000"/>
-              <a:satMod val="105000"/>
-            </a:schemeClr>
-          </a:solidFill>
-          <a:prstDash val="solid"/>
-        </a:ln>
-        <a:ln w="25400" cap="flat" cmpd="sng" algn="ctr">
+        <a:ln w="6350" cap="flat" cmpd="sng" algn="ctr">
           <a:solidFill>
             <a:schemeClr val="phClr"/>
           </a:solidFill>
           <a:prstDash val="solid"/>
+          <a:miter lim="800000"/>
         </a:ln>
-        <a:ln w="38100" cap="flat" cmpd="sng" algn="ctr">
+        <a:ln w="12700" cap="flat" cmpd="sng" algn="ctr">
           <a:solidFill>
             <a:schemeClr val="phClr"/>
           </a:solidFill>
           <a:prstDash val="solid"/>
+          <a:miter lim="800000"/>
+        </a:ln>
+        <a:ln w="19050" cap="flat" cmpd="sng" algn="ctr">
+          <a:solidFill>
+            <a:schemeClr val="phClr"/>
+          </a:solidFill>
+          <a:prstDash val="solid"/>
+          <a:miter lim="800000"/>
         </a:ln>
       </a:lnStyleLst>
       <a:effectStyleLst>
         <a:effectStyle>
+          <a:effectLst/>
+        </a:effectStyle>
+        <a:effectStyle>
+          <a:effectLst/>
+        </a:effectStyle>
+        <a:effectStyle>
           <a:effectLst>
-            <a:outerShdw blurRad="40000" dist="20000" dir="5400000" rotWithShape="0">
+            <a:outerShdw blurRad="57150" dist="19050" dir="5400000" algn="ctr" rotWithShape="0">
               <a:srgbClr val="000000">
-                <a:alpha val="38000"/>
+                <a:alpha val="63000"/>
               </a:srgbClr>
             </a:outerShdw>
           </a:effectLst>
-        </a:effectStyle>
-        <a:effectStyle>
-          <a:effectLst>
-            <a:outerShdw blurRad="40000" dist="23000" dir="5400000" rotWithShape="0">
-              <a:srgbClr val="000000">
-                <a:alpha val="35000"/>
-              </a:srgbClr>
-            </a:outerShdw>
-          </a:effectLst>
-        </a:effectStyle>
-        <a:effectStyle>
-          <a:effectLst>
-            <a:outerShdw blurRad="40000" dist="23000" dir="5400000" rotWithShape="0">
-              <a:srgbClr val="000000">
-                <a:alpha val="35000"/>
-              </a:srgbClr>
-            </a:outerShdw>
-          </a:effectLst>
-          <a:scene3d>
-            <a:camera prst="orthographicFront">
-              <a:rot lat="0" lon="0" rev="0"/>
-            </a:camera>
-            <a:lightRig rig="threePt" dir="t">
-              <a:rot lat="0" lon="0" rev="1200000"/>
-            </a:lightRig>
-          </a:scene3d>
-          <a:sp3d>
-            <a:bevelT w="63500" h="25400"/>
-          </a:sp3d>
         </a:effectStyle>
       </a:effectStyleLst>
       <a:bgFillStyleLst>
         <a:solidFill>
           <a:schemeClr val="phClr"/>
         </a:solidFill>
+        <a:solidFill>
+          <a:schemeClr val="phClr">
+            <a:tint val="95000"/>
+            <a:satMod val="170000"/>
+          </a:schemeClr>
+        </a:solidFill>
         <a:gradFill rotWithShape="1">
           <a:gsLst>
             <a:gs pos="0">
               <a:schemeClr val="phClr">
-                <a:tint val="40000"/>
-                <a:satMod val="350000"/>
+                <a:tint val="93000"/>
+                <a:satMod val="150000"/>
+                <a:shade val="98000"/>
+                <a:lumMod val="102000"/>
               </a:schemeClr>
             </a:gs>
-            <a:gs pos="40000">
+            <a:gs pos="50000">
               <a:schemeClr val="phClr">
-                <a:tint val="45000"/>
-                <a:shade val="99000"/>
-                <a:satMod val="350000"/>
+                <a:tint val="98000"/>
+                <a:satMod val="130000"/>
+                <a:shade val="90000"/>
+                <a:lumMod val="103000"/>
               </a:schemeClr>
             </a:gs>
             <a:gs pos="100000">
               <a:schemeClr val="phClr">
-                <a:shade val="20000"/>
-                <a:satMod val="255000"/>
+                <a:shade val="63000"/>
+                <a:satMod val="120000"/>
               </a:schemeClr>
             </a:gs>
           </a:gsLst>
-          <a:path path="circle">
-            <a:fillToRect l="50000" t="-80000" r="50000" b="180000"/>
-          </a:path>
-        </a:gradFill>
-        <a:gradFill rotWithShape="1">
-          <a:gsLst>
-            <a:gs pos="0">
-              <a:schemeClr val="phClr">
-                <a:tint val="80000"/>
-                <a:satMod val="300000"/>
-              </a:schemeClr>
-            </a:gs>
-            <a:gs pos="100000">
-              <a:schemeClr val="phClr">
-                <a:shade val="30000"/>
-                <a:satMod val="200000"/>
-              </a:schemeClr>
-            </a:gs>
-          </a:gsLst>
-          <a:path path="circle">
-            <a:fillToRect l="50000" t="50000" r="50000" b="50000"/>
-          </a:path>
+          <a:lin ang="5400000" scaled="0"/>
         </a:gradFill>
       </a:bgFillStyleLst>
     </a:fmtScheme>
   </a:themeElements>
-  <a:objectDefaults>
-    <a:spDef>
-      <a:spPr/>
-      <a:bodyPr/>
-      <a:lstStyle/>
-      <a:style>
-        <a:lnRef idx="1">
-          <a:schemeClr val="accent1"/>
-        </a:lnRef>
-        <a:fillRef idx="3">
-          <a:schemeClr val="accent1"/>
-        </a:fillRef>
-        <a:effectRef idx="2">
-          <a:schemeClr val="accent1"/>
-        </a:effectRef>
-        <a:fontRef idx="minor">
-          <a:schemeClr val="lt1"/>
-        </a:fontRef>
-      </a:style>
-    </a:spDef>
-    <a:lnDef>
-      <a:spPr/>
-      <a:bodyPr/>
-      <a:lstStyle/>
-      <a:style>
-        <a:lnRef idx="2">
-          <a:schemeClr val="accent1"/>
-        </a:lnRef>
-        <a:fillRef idx="0">
-          <a:schemeClr val="accent1"/>
-        </a:fillRef>
-        <a:effectRef idx="1">
-          <a:schemeClr val="accent1"/>
-        </a:effectRef>
-        <a:fontRef idx="minor">
-          <a:schemeClr val="tx1"/>
-        </a:fontRef>
-      </a:style>
-    </a:lnDef>
-  </a:objectDefaults>
+  <a:objectDefaults/>
   <a:extraClrSchemeLst/>
+  <a:extLst>
+    <a:ext uri="{05A4C25C-085E-4340-85A3-A5531E510DB2}">
+      <thm15:themeFamily xmlns:thm15="http://schemas.microsoft.com/office/thememl/2012/main" name="Office Theme" id="{2E142A2C-CD16-42D6-873A-C26D2A0506FA}" vid="{1BDDFF52-6CD6-40A5-AB3C-68EB2F1E4D0A}"/>
+    </a:ext>
+  </a:extLst>
 </a:theme>
 </file>
</xml_diff>